<commit_message>
added weather project and adjusted CV Doc
</commit_message>
<xml_diff>
--- a/public/ITDeveloper.docx
+++ b/public/ITDeveloper.docx
@@ -1,13 +1,13 @@
 
 <file path=word/document.xml><?xml version="1.0" encoding="utf-8"?>
-<w:document xmlns:r="http://schemas.openxmlformats.org/officeDocument/2006/relationships" xmlns:wp="http://schemas.openxmlformats.org/drawingml/2006/wordprocessingDrawing" xmlns:w="http://schemas.openxmlformats.org/wordprocessingml/2006/main" xmlns:w10="urn:schemas-microsoft-com:office:word" xmlns:w14="http://schemas.microsoft.com/office/word/2010/wordml" xmlns:wps="http://schemas.microsoft.com/office/word/2010/wordprocessingShape" xmlns:wpg="http://schemas.microsoft.com/office/word/2010/wordprocessingGroup" xmlns:mc="http://schemas.openxmlformats.org/markup-compatibility/2006" xmlns:v="urn:schemas-microsoft-com:vml" xmlns:o="urn:schemas-microsoft-com:office:office" xmlns:m="http://schemas.openxmlformats.org/officeDocument/2006/math" mc:Ignorable="w14">
+<w:document xmlns:wp14="http://schemas.microsoft.com/office/word/2010/wordprocessingDrawing" xmlns:r="http://schemas.openxmlformats.org/officeDocument/2006/relationships" xmlns:wp="http://schemas.openxmlformats.org/drawingml/2006/wordprocessingDrawing" xmlns:w="http://schemas.openxmlformats.org/wordprocessingml/2006/main" xmlns:w10="urn:schemas-microsoft-com:office:word" xmlns:w14="http://schemas.microsoft.com/office/word/2010/wordml" xmlns:wps="http://schemas.microsoft.com/office/word/2010/wordprocessingShape" xmlns:wpg="http://schemas.microsoft.com/office/word/2010/wordprocessingGroup" xmlns:mc="http://schemas.openxmlformats.org/markup-compatibility/2006" xmlns:v="urn:schemas-microsoft-com:vml" xmlns:o="urn:schemas-microsoft-com:office:office" xmlns:m="http://schemas.openxmlformats.org/officeDocument/2006/math" mc:Ignorable="w14 wp14">
   <w:body>
-    <w:p>
+    <w:p xmlns:wp14="http://schemas.microsoft.com/office/word/2010/wordml" wp14:textId="77777777">
       <w:pPr>
         <w:pStyle w:val="Normal.0"/>
         <w:jc w:val="right"/>
         <w:rPr>
-          <w:rFonts w:ascii="Arial" w:cs="Arial" w:hAnsi="Arial" w:eastAsia="Arial"/>
+          <w:rFonts w:ascii="Arial" w:hAnsi="Arial" w:eastAsia="Arial" w:cs="Arial"/>
           <w:b w:val="1"/>
           <w:bCs w:val="1"/>
           <w:outline w:val="0"/>
@@ -64,12 +64,12 @@
         <w:t xml:space="preserve">   </w:t>
       </w:r>
     </w:p>
-    <w:p>
+    <w:p xmlns:wp14="http://schemas.microsoft.com/office/word/2010/wordml" wp14:textId="77777777">
       <w:pPr>
         <w:pStyle w:val="Normal.0"/>
         <w:jc w:val="right"/>
         <w:rPr>
-          <w:rFonts w:ascii="Arial" w:cs="Arial" w:hAnsi="Arial" w:eastAsia="Arial"/>
+          <w:rFonts w:ascii="Arial" w:hAnsi="Arial" w:eastAsia="Arial" w:cs="Arial"/>
           <w:b w:val="1"/>
           <w:bCs w:val="1"/>
           <w:outline w:val="0"/>
@@ -106,12 +106,12 @@
         <w:t>IT developer (ECM)</w:t>
       </w:r>
     </w:p>
-    <w:p>
+    <w:p xmlns:wp14="http://schemas.microsoft.com/office/word/2010/wordml" wp14:textId="77777777">
       <w:pPr>
         <w:pStyle w:val="Normal.0"/>
         <w:jc w:val="right"/>
         <w:rPr>
-          <w:rFonts w:ascii="Arial" w:cs="Arial" w:hAnsi="Arial" w:eastAsia="Arial"/>
+          <w:rFonts w:ascii="Arial" w:hAnsi="Arial" w:eastAsia="Arial" w:cs="Arial"/>
           <w:sz w:val="20"/>
           <w:szCs w:val="20"/>
           <w:lang w:val="en-US"/>
@@ -140,12 +140,12 @@
         <w:t>: Gloucestershire</w:t>
       </w:r>
     </w:p>
-    <w:p>
+    <w:p xmlns:wp14="http://schemas.microsoft.com/office/word/2010/wordml" wp14:textId="77777777">
       <w:pPr>
         <w:pStyle w:val="Normal.0"/>
         <w:jc w:val="right"/>
         <w:rPr>
-          <w:rFonts w:ascii="Arial" w:cs="Arial" w:hAnsi="Arial" w:eastAsia="Arial"/>
+          <w:rFonts w:ascii="Arial" w:hAnsi="Arial" w:eastAsia="Arial" w:cs="Arial"/>
           <w:sz w:val="20"/>
           <w:szCs w:val="20"/>
           <w:lang w:val="en-US"/>
@@ -174,12 +174,12 @@
         <w:t>: 07584040980</w:t>
       </w:r>
     </w:p>
-    <w:p>
+    <w:p xmlns:wp14="http://schemas.microsoft.com/office/word/2010/wordml" wp14:textId="77777777">
       <w:pPr>
         <w:pStyle w:val="Normal.0"/>
         <w:jc w:val="right"/>
         <w:rPr>
-          <w:rFonts w:ascii="Arial" w:cs="Arial" w:hAnsi="Arial" w:eastAsia="Arial"/>
+          <w:rFonts w:ascii="Arial" w:hAnsi="Arial" w:eastAsia="Arial" w:cs="Arial"/>
           <w:sz w:val="20"/>
           <w:szCs w:val="20"/>
           <w:lang w:val="en-US"/>
@@ -210,7 +210,7 @@
       <w:r>
         <w:rPr>
           <w:rStyle w:val="Hyperlink.0"/>
-          <w:rFonts w:ascii="Arial" w:cs="Arial" w:hAnsi="Arial" w:eastAsia="Arial"/>
+          <w:rFonts w:ascii="Arial" w:hAnsi="Arial" w:eastAsia="Arial" w:cs="Arial"/>
           <w:sz w:val="20"/>
           <w:szCs w:val="20"/>
           <w:lang w:val="en-US"/>
@@ -220,7 +220,7 @@
       <w:r>
         <w:rPr>
           <w:rStyle w:val="Hyperlink.0"/>
-          <w:rFonts w:ascii="Arial" w:cs="Arial" w:hAnsi="Arial" w:eastAsia="Arial"/>
+          <w:rFonts w:ascii="Arial" w:hAnsi="Arial" w:eastAsia="Arial" w:cs="Arial"/>
           <w:sz w:val="20"/>
           <w:szCs w:val="20"/>
           <w:lang w:val="en-US"/>
@@ -230,7 +230,7 @@
       <w:r>
         <w:rPr>
           <w:rStyle w:val="Hyperlink.0"/>
-          <w:rFonts w:ascii="Arial" w:cs="Arial" w:hAnsi="Arial" w:eastAsia="Arial"/>
+          <w:rFonts w:ascii="Arial" w:hAnsi="Arial" w:eastAsia="Arial" w:cs="Arial"/>
           <w:sz w:val="20"/>
           <w:szCs w:val="20"/>
           <w:lang w:val="en-US"/>
@@ -255,11 +255,11 @@
         <w:fldChar w:fldCharType="end" w:fldLock="0"/>
       </w:r>
     </w:p>
-    <w:p>
-      <w:pPr>
-        <w:pStyle w:val="Normal.0"/>
-        <w:rPr>
-          <w:rFonts w:ascii="Arial" w:cs="Arial" w:hAnsi="Arial" w:eastAsia="Arial"/>
+    <w:p xmlns:wp14="http://schemas.microsoft.com/office/word/2010/wordml" wp14:textId="77777777">
+      <w:pPr>
+        <w:pStyle w:val="Normal.0"/>
+        <w:rPr>
+          <w:rFonts w:ascii="Arial" w:hAnsi="Arial" w:eastAsia="Arial" w:cs="Arial"/>
           <w:b w:val="1"/>
           <w:bCs w:val="1"/>
           <w:outline w:val="0"/>
@@ -296,7 +296,7 @@
         <w:t>Professional Profile</w:t>
       </w:r>
     </w:p>
-    <w:p>
+    <w:p xmlns:wp14="http://schemas.microsoft.com/office/word/2010/wordml" wp14:textId="77777777">
       <w:pPr>
         <w:pStyle w:val="Default"/>
         <w:bidi w:val="0"/>
@@ -304,7 +304,7 @@
         <w:ind w:left="0" w:right="0" w:firstLine="0"/>
         <w:jc w:val="left"/>
         <w:rPr>
-          <w:rFonts w:ascii="Arial" w:cs="Arial" w:hAnsi="Arial" w:eastAsia="Arial"/>
+          <w:rFonts w:ascii="Arial" w:hAnsi="Arial" w:eastAsia="Arial" w:cs="Arial"/>
           <w:sz w:val="20"/>
           <w:szCs w:val="20"/>
           <w:u w:color="44546a"/>
@@ -368,7 +368,7 @@
         <w:t xml:space="preserve"> solutions that meet business needs. With strong expertise in C#, I have successfully developed and automated processes such as streaming documents through APIs, designing GDPR-compliant workflows, and enhancing existing systems like the ELTO process for better readability and efficiency.</w:t>
       </w:r>
     </w:p>
-    <w:p>
+    <w:p xmlns:wp14="http://schemas.microsoft.com/office/word/2010/wordml" wp14:textId="77777777">
       <w:pPr>
         <w:pStyle w:val="Default"/>
         <w:bidi w:val="0"/>
@@ -376,7 +376,7 @@
         <w:ind w:left="0" w:right="0" w:firstLine="0"/>
         <w:jc w:val="left"/>
         <w:rPr>
-          <w:rFonts w:ascii="Arial" w:cs="Arial" w:hAnsi="Arial" w:eastAsia="Arial"/>
+          <w:rFonts w:ascii="Arial" w:hAnsi="Arial" w:eastAsia="Arial" w:cs="Arial"/>
           <w:b w:val="1"/>
           <w:bCs w:val="1"/>
           <w:outline w:val="0"/>
@@ -405,7 +405,7 @@
         <w:t>I excel in cross-functional team environments, collaborating closely with stakeholders to ensure expectations are managed effectively. My focus on error reduction and improving user experience underpins my approach to development. I am hardworking, self-motivated, and thrive in both individual and team settings, bringing a strong attention to detail to every project I undertake.</w:t>
       </w:r>
     </w:p>
-    <w:p>
+    <w:p xmlns:wp14="http://schemas.microsoft.com/office/word/2010/wordml" wp14:textId="77777777">
       <w:pPr>
         <w:pStyle w:val="Default"/>
         <w:bidi w:val="0"/>
@@ -413,20 +413,20 @@
         <w:ind w:left="0" w:right="0" w:firstLine="0"/>
         <w:jc w:val="left"/>
         <w:rPr>
-          <w:rFonts w:ascii="Arial" w:cs="Arial" w:hAnsi="Arial" w:eastAsia="Arial"/>
-          <w:sz w:val="20"/>
-          <w:szCs w:val="20"/>
-          <w:rtl w:val="0"/>
-          <w:lang w:val="en-US"/>
-        </w:rPr>
-      </w:pPr>
-    </w:p>
-    <w:p>
+          <w:rFonts w:ascii="Arial" w:hAnsi="Arial" w:eastAsia="Arial" w:cs="Arial"/>
+          <w:sz w:val="20"/>
+          <w:szCs w:val="20"/>
+          <w:rtl w:val="0"/>
+          <w:lang w:val="en-US"/>
+        </w:rPr>
+      </w:pPr>
+    </w:p>
+    <w:p xmlns:wp14="http://schemas.microsoft.com/office/word/2010/wordml" wp14:textId="77777777">
       <w:pPr>
         <w:pStyle w:val="Normal.0"/>
         <w:jc w:val="both"/>
         <w:rPr>
-          <w:rFonts w:ascii="Arial" w:cs="Arial" w:hAnsi="Arial" w:eastAsia="Arial"/>
+          <w:rFonts w:ascii="Arial" w:hAnsi="Arial" w:eastAsia="Arial" w:cs="Arial"/>
           <w:b w:val="1"/>
           <w:bCs w:val="1"/>
           <w:sz w:val="20"/>
@@ -446,12 +446,12 @@
         <w:t>Skills</w:t>
       </w:r>
     </w:p>
-    <w:p>
+    <w:p xmlns:wp14="http://schemas.microsoft.com/office/word/2010/wordml" wp14:textId="231BB23E">
       <w:pPr>
         <w:pStyle w:val="Normal.0"/>
         <w:jc w:val="both"/>
         <w:rPr>
-          <w:rFonts w:ascii="Arial" w:cs="Arial" w:hAnsi="Arial" w:eastAsia="Arial"/>
+          <w:rFonts w:ascii="Arial" w:hAnsi="Arial" w:eastAsia="Arial" w:cs="Arial"/>
           <w:b w:val="1"/>
           <w:bCs w:val="1"/>
           <w:sz w:val="20"/>
@@ -466,7 +466,6 @@
           <w:outline w:val="0"/>
           <w:color w:val="eb4c3f"/>
           <w:u w:val="single" w:color="eb4c3f"/>
-          <w:rtl w:val="0"/>
           <w:lang w:val="en-US"/>
           <w14:textFill>
             <w14:solidFill>
@@ -483,7 +482,6 @@
           <w:bCs w:val="1"/>
           <w:sz w:val="20"/>
           <w:szCs w:val="20"/>
-          <w:rtl w:val="0"/>
           <w:lang w:val="en-US"/>
         </w:rPr>
         <w:t xml:space="preserve">: </w:t>
@@ -495,7 +493,6 @@
           <w:bCs w:val="1"/>
           <w:sz w:val="20"/>
           <w:szCs w:val="20"/>
-          <w:rtl w:val="0"/>
           <w:lang w:val="en-US"/>
         </w:rPr>
         <w:t xml:space="preserve">C#, </w:t>
@@ -507,13 +504,103 @@
           <w:bCs w:val="1"/>
           <w:sz w:val="20"/>
           <w:szCs w:val="20"/>
-          <w:rtl w:val="0"/>
-          <w:lang w:val="en-US"/>
-        </w:rPr>
-        <w:t>JavaScript,  ReactJS, Context API, RESTFUL API, REDUX, HTML5, SCSS, GIT, Bootstrap,     Material-UI, Materialize</w:t>
-      </w:r>
-    </w:p>
-    <w:p>
+          <w:lang w:val="en-US"/>
+        </w:rPr>
+        <w:t xml:space="preserve">JavaScript, ReactJS, Context API, RESTFUL API, REDUX, HTML5, SCSS, GIT, </w:t>
+      </w:r>
+      <w:r>
+        <w:rPr>
+          <w:rFonts w:ascii="Arial" w:hAnsi="Arial"/>
+          <w:b w:val="1"/>
+          <w:bCs w:val="1"/>
+          <w:sz w:val="20"/>
+          <w:szCs w:val="20"/>
+          <w:lang w:val="en-US"/>
+        </w:rPr>
+        <w:t>Bootstrap, Material</w:t>
+      </w:r>
+      <w:r>
+        <w:rPr>
+          <w:rFonts w:ascii="Arial" w:hAnsi="Arial"/>
+          <w:b w:val="1"/>
+          <w:bCs w:val="1"/>
+          <w:sz w:val="20"/>
+          <w:szCs w:val="20"/>
+          <w:lang w:val="en-US"/>
+        </w:rPr>
+        <w:t>-UI, Materialize</w:t>
+      </w:r>
+    </w:p>
+    <w:p xmlns:wp14="http://schemas.microsoft.com/office/word/2010/wordml" wp14:textId="17B29E2E">
+      <w:pPr>
+        <w:pStyle w:val="Normal.0"/>
+        <w:pBdr>
+          <w:top w:val="nil" w:color="000000" w:sz="0" w:space="0"/>
+          <w:left w:val="nil" w:color="000000" w:sz="0" w:space="0"/>
+          <w:bottom w:val="single" w:color="000000" w:sz="6" w:space="0" w:shadow="0" w:frame="0"/>
+          <w:right w:val="nil" w:color="000000" w:sz="0" w:space="0"/>
+        </w:pBdr>
+        <w:jc w:val="both"/>
+        <w:rPr>
+          <w:rFonts w:ascii="Arial" w:hAnsi="Arial" w:eastAsia="Arial" w:cs="Arial"/>
+          <w:b w:val="1"/>
+          <w:bCs w:val="1"/>
+          <w:sz w:val="20"/>
+          <w:szCs w:val="20"/>
+        </w:rPr>
+      </w:pPr>
+      <w:r>
+        <w:rPr>
+          <w:rFonts w:ascii="Arial" w:hAnsi="Arial"/>
+          <w:b w:val="1"/>
+          <w:bCs w:val="1"/>
+          <w:outline w:val="0"/>
+          <w:color w:val="eb4c3e"/>
+          <w:u w:val="single" w:color="eb4c3e"/>
+          <w:lang w:val="en-US"/>
+          <w14:textFill>
+            <w14:solidFill>
+              <w14:srgbClr w14:val="EB4C3E"/>
+            </w14:solidFill>
+          </w14:textFill>
+        </w:rPr>
+        <w:t>Familiar</w:t>
+      </w:r>
+      <w:r>
+        <w:rPr>
+          <w:rFonts w:ascii="Arial" w:hAnsi="Arial"/>
+          <w:b w:val="1"/>
+          <w:bCs w:val="1"/>
+          <w:sz w:val="20"/>
+          <w:szCs w:val="20"/>
+          <w:lang w:val="en-US"/>
+        </w:rPr>
+        <w:t xml:space="preserve">: </w:t>
+      </w:r>
+      <w:r>
+        <w:rPr>
+          <w:rFonts w:ascii="Arial" w:hAnsi="Arial"/>
+          <w:b w:val="1"/>
+          <w:bCs w:val="1"/>
+          <w:sz w:val="20"/>
+          <w:szCs w:val="20"/>
+          <w:lang w:val="en-US"/>
+        </w:rPr>
+        <w:t>GraphQL</w:t>
+      </w:r>
+      <w:r>
+        <w:rPr>
+          <w:rFonts w:ascii="Arial" w:hAnsi="Arial"/>
+          <w:b w:val="1"/>
+          <w:bCs w:val="1"/>
+          <w:sz w:val="20"/>
+          <w:szCs w:val="20"/>
+          <w:lang w:val="en-US"/>
+        </w:rPr>
+        <w:t>, Mongo DB, MYSQL</w:t>
+      </w:r>
+    </w:p>
+    <w:p xmlns:wp14="http://schemas.microsoft.com/office/word/2010/wordml" wp14:textId="77777777">
       <w:pPr>
         <w:pStyle w:val="Normal.0"/>
         <w:pBdr>
@@ -524,81 +611,32 @@
         </w:pBdr>
         <w:jc w:val="both"/>
         <w:rPr>
-          <w:rFonts w:ascii="Arial" w:cs="Arial" w:hAnsi="Arial" w:eastAsia="Arial"/>
-          <w:b w:val="1"/>
-          <w:bCs w:val="1"/>
-          <w:sz w:val="20"/>
-          <w:szCs w:val="20"/>
-        </w:rPr>
-      </w:pPr>
-      <w:r>
-        <w:rPr>
-          <w:rFonts w:ascii="Arial" w:hAnsi="Arial"/>
-          <w:b w:val="1"/>
-          <w:bCs w:val="1"/>
-          <w:outline w:val="0"/>
-          <w:color w:val="eb4c3e"/>
-          <w:u w:val="single" w:color="eb4c3e"/>
-          <w:rtl w:val="0"/>
-          <w:lang w:val="en-US"/>
-          <w14:textFill>
-            <w14:solidFill>
-              <w14:srgbClr w14:val="EB4C3E"/>
-            </w14:solidFill>
-          </w14:textFill>
-        </w:rPr>
-        <w:t>Familiar</w:t>
-      </w:r>
-      <w:r>
-        <w:rPr>
-          <w:rFonts w:ascii="Arial" w:hAnsi="Arial"/>
-          <w:b w:val="1"/>
-          <w:bCs w:val="1"/>
-          <w:sz w:val="20"/>
-          <w:szCs w:val="20"/>
-          <w:rtl w:val="0"/>
-          <w:lang w:val="en-US"/>
-        </w:rPr>
-        <w:t>: GraphQL,  Mongo DB, MYSQL</w:t>
-      </w:r>
-    </w:p>
-    <w:p>
-      <w:pPr>
-        <w:pStyle w:val="Normal.0"/>
-        <w:pBdr>
-          <w:top w:val="nil"/>
-          <w:left w:val="nil"/>
-          <w:bottom w:val="single" w:color="000000" w:sz="6" w:space="0" w:shadow="0" w:frame="0"/>
-          <w:right w:val="nil"/>
-        </w:pBdr>
-        <w:jc w:val="both"/>
-        <w:rPr>
-          <w:rFonts w:ascii="Arial" w:cs="Arial" w:hAnsi="Arial" w:eastAsia="Arial"/>
-          <w:b w:val="1"/>
-          <w:bCs w:val="1"/>
-          <w:sz w:val="20"/>
-          <w:szCs w:val="20"/>
-        </w:rPr>
-      </w:pPr>
-    </w:p>
-    <w:p>
-      <w:pPr>
-        <w:pStyle w:val="Normal.0"/>
-        <w:rPr>
-          <w:rFonts w:ascii="Arial" w:cs="Arial" w:hAnsi="Arial" w:eastAsia="Arial"/>
-          <w:b w:val="1"/>
-          <w:bCs w:val="1"/>
-          <w:sz w:val="20"/>
-          <w:szCs w:val="20"/>
-          <w:lang w:val="en-US"/>
-        </w:rPr>
-      </w:pPr>
-    </w:p>
-    <w:p>
-      <w:pPr>
-        <w:pStyle w:val="Normal.0"/>
-        <w:rPr>
-          <w:rFonts w:ascii="Arial" w:cs="Arial" w:hAnsi="Arial" w:eastAsia="Arial"/>
+          <w:rFonts w:ascii="Arial" w:hAnsi="Arial" w:eastAsia="Arial" w:cs="Arial"/>
+          <w:b w:val="1"/>
+          <w:bCs w:val="1"/>
+          <w:sz w:val="20"/>
+          <w:szCs w:val="20"/>
+        </w:rPr>
+      </w:pPr>
+    </w:p>
+    <w:p xmlns:wp14="http://schemas.microsoft.com/office/word/2010/wordml" wp14:textId="77777777">
+      <w:pPr>
+        <w:pStyle w:val="Normal.0"/>
+        <w:rPr>
+          <w:rFonts w:ascii="Arial" w:hAnsi="Arial" w:eastAsia="Arial" w:cs="Arial"/>
+          <w:b w:val="1"/>
+          <w:bCs w:val="1"/>
+          <w:sz w:val="20"/>
+          <w:szCs w:val="20"/>
+          <w:lang w:val="en-US"/>
+        </w:rPr>
+      </w:pPr>
+    </w:p>
+    <w:p xmlns:wp14="http://schemas.microsoft.com/office/word/2010/wordml" wp14:textId="77777777">
+      <w:pPr>
+        <w:pStyle w:val="Normal.0"/>
+        <w:rPr>
+          <w:rFonts w:ascii="Arial" w:hAnsi="Arial" w:eastAsia="Arial" w:cs="Arial"/>
           <w:b w:val="1"/>
           <w:bCs w:val="1"/>
           <w:sz w:val="20"/>
@@ -627,11 +665,11 @@
         <w:t>Career Summary</w:t>
       </w:r>
     </w:p>
-    <w:p>
-      <w:pPr>
-        <w:pStyle w:val="Normal.0"/>
-        <w:rPr>
-          <w:rFonts w:ascii="Arial" w:cs="Arial" w:hAnsi="Arial" w:eastAsia="Arial"/>
+    <w:p xmlns:wp14="http://schemas.microsoft.com/office/word/2010/wordml" wp14:textId="77777777">
+      <w:pPr>
+        <w:pStyle w:val="Normal.0"/>
+        <w:rPr>
+          <w:rFonts w:ascii="Arial" w:hAnsi="Arial" w:eastAsia="Arial" w:cs="Arial"/>
           <w:b w:val="1"/>
           <w:bCs w:val="1"/>
           <w:sz w:val="20"/>
@@ -652,25 +690,25 @@
         <w:t>July 2020 - Present</w:t>
       </w:r>
     </w:p>
-    <w:p>
-      <w:pPr>
-        <w:pStyle w:val="Normal.0"/>
-        <w:rPr>
-          <w:rFonts w:ascii="Arial" w:cs="Arial" w:hAnsi="Arial" w:eastAsia="Arial"/>
-          <w:b w:val="1"/>
-          <w:bCs w:val="1"/>
-          <w:sz w:val="20"/>
-          <w:szCs w:val="20"/>
-          <w:lang w:val="en-US"/>
-        </w:rPr>
-      </w:pPr>
-    </w:p>
-    <w:p>
+    <w:p xmlns:wp14="http://schemas.microsoft.com/office/word/2010/wordml" wp14:textId="77777777">
+      <w:pPr>
+        <w:pStyle w:val="Normal.0"/>
+        <w:rPr>
+          <w:rFonts w:ascii="Arial" w:hAnsi="Arial" w:eastAsia="Arial" w:cs="Arial"/>
+          <w:b w:val="1"/>
+          <w:bCs w:val="1"/>
+          <w:sz w:val="20"/>
+          <w:szCs w:val="20"/>
+          <w:lang w:val="en-US"/>
+        </w:rPr>
+      </w:pPr>
+    </w:p>
+    <w:p xmlns:wp14="http://schemas.microsoft.com/office/word/2010/wordml" wp14:textId="77777777">
       <w:pPr>
         <w:pStyle w:val="Normal.0"/>
         <w:jc w:val="center"/>
         <w:rPr>
-          <w:rFonts w:ascii="Arial" w:cs="Arial" w:hAnsi="Arial" w:eastAsia="Arial"/>
+          <w:rFonts w:ascii="Arial" w:hAnsi="Arial" w:eastAsia="Arial" w:cs="Arial"/>
           <w:b w:val="1"/>
           <w:bCs w:val="1"/>
           <w:sz w:val="20"/>
@@ -691,25 +729,25 @@
         <w:t>Company: Ageas Insurance Ltd</w:t>
       </w:r>
     </w:p>
-    <w:p>
-      <w:pPr>
-        <w:pStyle w:val="Normal.0"/>
-        <w:rPr>
-          <w:rFonts w:ascii="Arial" w:cs="Arial" w:hAnsi="Arial" w:eastAsia="Arial"/>
-          <w:b w:val="1"/>
-          <w:bCs w:val="1"/>
-          <w:sz w:val="20"/>
-          <w:szCs w:val="20"/>
-          <w:lang w:val="en-US"/>
-        </w:rPr>
-      </w:pPr>
-    </w:p>
-    <w:p>
+    <w:p xmlns:wp14="http://schemas.microsoft.com/office/word/2010/wordml" wp14:textId="77777777">
+      <w:pPr>
+        <w:pStyle w:val="Normal.0"/>
+        <w:rPr>
+          <w:rFonts w:ascii="Arial" w:hAnsi="Arial" w:eastAsia="Arial" w:cs="Arial"/>
+          <w:b w:val="1"/>
+          <w:bCs w:val="1"/>
+          <w:sz w:val="20"/>
+          <w:szCs w:val="20"/>
+          <w:lang w:val="en-US"/>
+        </w:rPr>
+      </w:pPr>
+    </w:p>
+    <w:p xmlns:wp14="http://schemas.microsoft.com/office/word/2010/wordml" wp14:textId="77777777">
       <w:pPr>
         <w:pStyle w:val="Normal.0"/>
         <w:jc w:val="center"/>
         <w:rPr>
-          <w:rFonts w:ascii="Arial" w:cs="Arial" w:hAnsi="Arial" w:eastAsia="Arial"/>
+          <w:rFonts w:ascii="Arial" w:hAnsi="Arial" w:eastAsia="Arial" w:cs="Arial"/>
           <w:b w:val="1"/>
           <w:bCs w:val="1"/>
           <w:sz w:val="20"/>
@@ -742,11 +780,11 @@
         <w:t>IT Developer</w:t>
       </w:r>
     </w:p>
-    <w:p>
-      <w:pPr>
-        <w:pStyle w:val="Normal.0"/>
-        <w:rPr>
-          <w:rFonts w:ascii="Arial" w:cs="Arial" w:hAnsi="Arial" w:eastAsia="Arial"/>
+    <w:p xmlns:wp14="http://schemas.microsoft.com/office/word/2010/wordml" wp14:textId="77777777">
+      <w:pPr>
+        <w:pStyle w:val="Normal.0"/>
+        <w:rPr>
+          <w:rFonts w:ascii="Arial" w:hAnsi="Arial" w:eastAsia="Arial" w:cs="Arial"/>
           <w:b w:val="1"/>
           <w:bCs w:val="1"/>
           <w:sz w:val="20"/>
@@ -787,11 +825,11 @@
         <w:t>:</w:t>
       </w:r>
     </w:p>
-    <w:p>
-      <w:pPr>
-        <w:pStyle w:val="Normal.0"/>
-        <w:rPr>
-          <w:rFonts w:ascii="Arial" w:cs="Arial" w:hAnsi="Arial" w:eastAsia="Arial"/>
+    <w:p xmlns:wp14="http://schemas.microsoft.com/office/word/2010/wordml" wp14:textId="77777777">
+      <w:pPr>
+        <w:pStyle w:val="Normal.0"/>
+        <w:rPr>
+          <w:rFonts w:ascii="Arial" w:hAnsi="Arial" w:eastAsia="Arial" w:cs="Arial"/>
           <w:sz w:val="20"/>
           <w:szCs w:val="20"/>
         </w:rPr>
@@ -847,11 +885,11 @@
         <w:t xml:space="preserve"> specific needs.</w:t>
       </w:r>
     </w:p>
-    <w:p>
-      <w:pPr>
-        <w:pStyle w:val="Normal.0"/>
-        <w:rPr>
-          <w:rFonts w:ascii="Arial" w:cs="Arial" w:hAnsi="Arial" w:eastAsia="Arial"/>
+    <w:p xmlns:wp14="http://schemas.microsoft.com/office/word/2010/wordml" wp14:textId="77777777">
+      <w:pPr>
+        <w:pStyle w:val="Normal.0"/>
+        <w:rPr>
+          <w:rFonts w:ascii="Arial" w:hAnsi="Arial" w:eastAsia="Arial" w:cs="Arial"/>
           <w:sz w:val="20"/>
           <w:szCs w:val="20"/>
         </w:rPr>
@@ -867,50 +905,50 @@
         <w:t>I work across multiple departments, particularly those dependent on OnBase or its integrations (such as I-Series and Webservice), guiding projects from the development stage through to production. I leverage my expertise in C# to build custom scripts that extend OnBase functionalities, automating complex business processes that cannot be achieved through default workflow options.</w:t>
       </w:r>
     </w:p>
-    <w:p>
-      <w:pPr>
-        <w:pStyle w:val="Normal.0"/>
-        <w:rPr>
-          <w:rFonts w:ascii="Arial" w:cs="Arial" w:hAnsi="Arial" w:eastAsia="Arial"/>
-          <w:b w:val="1"/>
-          <w:bCs w:val="1"/>
-          <w:sz w:val="20"/>
-          <w:szCs w:val="20"/>
-          <w:lang w:val="en-US"/>
-        </w:rPr>
-      </w:pPr>
-    </w:p>
-    <w:p>
-      <w:pPr>
-        <w:pStyle w:val="Normal.0"/>
-        <w:rPr>
-          <w:rFonts w:ascii="Arial" w:cs="Arial" w:hAnsi="Arial" w:eastAsia="Arial"/>
-          <w:b w:val="1"/>
-          <w:bCs w:val="1"/>
-          <w:sz w:val="20"/>
-          <w:szCs w:val="20"/>
-          <w:lang w:val="en-US"/>
-        </w:rPr>
-      </w:pPr>
-    </w:p>
-    <w:p>
-      <w:pPr>
-        <w:pStyle w:val="Normal.0"/>
-        <w:rPr>
-          <w:rFonts w:ascii="Arial" w:cs="Arial" w:hAnsi="Arial" w:eastAsia="Arial"/>
-          <w:b w:val="1"/>
-          <w:bCs w:val="1"/>
-          <w:sz w:val="20"/>
-          <w:szCs w:val="20"/>
-          <w:lang w:val="en-US"/>
-        </w:rPr>
-      </w:pPr>
-    </w:p>
-    <w:p>
-      <w:pPr>
-        <w:pStyle w:val="Normal.0"/>
-        <w:rPr>
-          <w:rFonts w:ascii="Arial" w:cs="Arial" w:hAnsi="Arial" w:eastAsia="Arial"/>
+    <w:p xmlns:wp14="http://schemas.microsoft.com/office/word/2010/wordml" wp14:textId="77777777">
+      <w:pPr>
+        <w:pStyle w:val="Normal.0"/>
+        <w:rPr>
+          <w:rFonts w:ascii="Arial" w:hAnsi="Arial" w:eastAsia="Arial" w:cs="Arial"/>
+          <w:b w:val="1"/>
+          <w:bCs w:val="1"/>
+          <w:sz w:val="20"/>
+          <w:szCs w:val="20"/>
+          <w:lang w:val="en-US"/>
+        </w:rPr>
+      </w:pPr>
+    </w:p>
+    <w:p xmlns:wp14="http://schemas.microsoft.com/office/word/2010/wordml" wp14:textId="77777777">
+      <w:pPr>
+        <w:pStyle w:val="Normal.0"/>
+        <w:rPr>
+          <w:rFonts w:ascii="Arial" w:hAnsi="Arial" w:eastAsia="Arial" w:cs="Arial"/>
+          <w:b w:val="1"/>
+          <w:bCs w:val="1"/>
+          <w:sz w:val="20"/>
+          <w:szCs w:val="20"/>
+          <w:lang w:val="en-US"/>
+        </w:rPr>
+      </w:pPr>
+    </w:p>
+    <w:p xmlns:wp14="http://schemas.microsoft.com/office/word/2010/wordml" wp14:textId="77777777">
+      <w:pPr>
+        <w:pStyle w:val="Normal.0"/>
+        <w:rPr>
+          <w:rFonts w:ascii="Arial" w:hAnsi="Arial" w:eastAsia="Arial" w:cs="Arial"/>
+          <w:b w:val="1"/>
+          <w:bCs w:val="1"/>
+          <w:sz w:val="20"/>
+          <w:szCs w:val="20"/>
+          <w:lang w:val="en-US"/>
+        </w:rPr>
+      </w:pPr>
+    </w:p>
+    <w:p xmlns:wp14="http://schemas.microsoft.com/office/word/2010/wordml" wp14:textId="77777777">
+      <w:pPr>
+        <w:pStyle w:val="Normal.0"/>
+        <w:rPr>
+          <w:rFonts w:ascii="Arial" w:hAnsi="Arial" w:eastAsia="Arial" w:cs="Arial"/>
           <w:b w:val="1"/>
           <w:bCs w:val="1"/>
           <w:sz w:val="20"/>
@@ -951,24 +989,24 @@
         <w:t>:</w:t>
       </w:r>
     </w:p>
-    <w:p>
-      <w:pPr>
-        <w:pStyle w:val="Normal.0"/>
-        <w:rPr>
-          <w:rFonts w:ascii="Arial" w:cs="Arial" w:hAnsi="Arial" w:eastAsia="Arial"/>
-          <w:b w:val="1"/>
-          <w:bCs w:val="1"/>
-          <w:sz w:val="20"/>
-          <w:szCs w:val="20"/>
-          <w:lang w:val="en-US"/>
-        </w:rPr>
-      </w:pPr>
-    </w:p>
-    <w:p>
-      <w:pPr>
-        <w:pStyle w:val="Normal.0"/>
-        <w:rPr>
-          <w:rFonts w:ascii="Arial" w:cs="Arial" w:hAnsi="Arial" w:eastAsia="Arial"/>
+    <w:p xmlns:wp14="http://schemas.microsoft.com/office/word/2010/wordml" wp14:textId="77777777">
+      <w:pPr>
+        <w:pStyle w:val="Normal.0"/>
+        <w:rPr>
+          <w:rFonts w:ascii="Arial" w:hAnsi="Arial" w:eastAsia="Arial" w:cs="Arial"/>
+          <w:b w:val="1"/>
+          <w:bCs w:val="1"/>
+          <w:sz w:val="20"/>
+          <w:szCs w:val="20"/>
+          <w:lang w:val="en-US"/>
+        </w:rPr>
+      </w:pPr>
+    </w:p>
+    <w:p xmlns:wp14="http://schemas.microsoft.com/office/word/2010/wordml" wp14:textId="77777777">
+      <w:pPr>
+        <w:pStyle w:val="Normal.0"/>
+        <w:rPr>
+          <w:rFonts w:ascii="Arial" w:hAnsi="Arial" w:eastAsia="Arial" w:cs="Arial"/>
           <w:outline w:val="0"/>
           <w:color w:val="44546a"/>
           <w:sz w:val="20"/>
@@ -987,11 +1025,12 @@
           <w:pgSz w:w="11900" w:h="16840" w:orient="portrait"/>
           <w:pgMar w:top="1440" w:right="701" w:bottom="1440" w:left="993" w:header="708" w:footer="708"/>
           <w:bidi w:val="0"/>
+          <w:cols w:num="1"/>
         </w:sectPr>
       </w:pPr>
       <w:r>
         <w:rPr>
-          <w:rFonts w:ascii="Arial" w:cs="Arial" w:hAnsi="Arial" w:eastAsia="Arial"/>
+          <w:rFonts w:ascii="Arial" w:hAnsi="Arial" w:eastAsia="Arial" w:cs="Arial"/>
           <w:outline w:val="0"/>
           <w:color w:val="44546a"/>
           <w:sz w:val="20"/>
@@ -1006,7 +1045,7 @@
         </w:rPr>
       </w:r>
     </w:p>
-    <w:p>
+    <w:p xmlns:wp14="http://schemas.microsoft.com/office/word/2010/wordml" wp14:textId="77777777">
       <w:pPr>
         <w:pStyle w:val="Normal.0"/>
         <w:numPr>
@@ -1069,7 +1108,7 @@
         <w:t>with business analysts, end-users, and other stakeholders to design and implement OnBase solutions.</w:t>
       </w:r>
     </w:p>
-    <w:p>
+    <w:p xmlns:wp14="http://schemas.microsoft.com/office/word/2010/wordml" wp14:textId="269BDBF8">
       <w:pPr>
         <w:pStyle w:val="Normal.0"/>
         <w:numPr>
@@ -1088,23 +1127,30 @@
           <w:rFonts w:ascii="Arial" w:hAnsi="Arial"/>
           <w:sz w:val="20"/>
           <w:szCs w:val="20"/>
-          <w:rtl w:val="0"/>
-          <w:lang w:val="en-US"/>
-        </w:rPr>
-        <w:t>Automation and Workflow:</w:t>
-      </w:r>
-      <w:r>
-        <w:rPr>
-          <w:rFonts w:ascii="Arial" w:hAnsi="Arial"/>
-          <w:sz w:val="20"/>
-          <w:szCs w:val="20"/>
-          <w:rtl w:val="0"/>
-          <w:lang w:val="en-US"/>
-        </w:rPr>
-        <w:t>Build and automate workflows for document routing and linking to streamline business processes.</w:t>
-      </w:r>
-    </w:p>
-    <w:p>
+          <w:lang w:val="en-US"/>
+        </w:rPr>
+        <w:t xml:space="preserve">Automation and </w:t>
+      </w:r>
+      <w:r>
+        <w:rPr>
+          <w:rFonts w:ascii="Arial" w:hAnsi="Arial"/>
+          <w:sz w:val="20"/>
+          <w:szCs w:val="20"/>
+          <w:lang w:val="en-US"/>
+        </w:rPr>
+        <w:t>Workflow: Build</w:t>
+      </w:r>
+      <w:r>
+        <w:rPr>
+          <w:rFonts w:ascii="Arial" w:hAnsi="Arial"/>
+          <w:sz w:val="20"/>
+          <w:szCs w:val="20"/>
+          <w:lang w:val="en-US"/>
+        </w:rPr>
+        <w:t xml:space="preserve"> and automate workflows for document routing and linking to streamline business processes.</w:t>
+      </w:r>
+    </w:p>
+    <w:p xmlns:wp14="http://schemas.microsoft.com/office/word/2010/wordml" wp14:textId="77777777">
       <w:pPr>
         <w:pStyle w:val="Normal.0"/>
         <w:numPr>
@@ -1139,7 +1185,7 @@
         <w:t>Develop custom scripts for data validation, document processing, and advanced workflow automation using C#.</w:t>
       </w:r>
     </w:p>
-    <w:p>
+    <w:p xmlns:wp14="http://schemas.microsoft.com/office/word/2010/wordml" wp14:textId="6EA1925C">
       <w:pPr>
         <w:pStyle w:val="Normal.0"/>
         <w:numPr>
@@ -1158,43 +1204,41 @@
           <w:rFonts w:ascii="Arial" w:hAnsi="Arial"/>
           <w:sz w:val="20"/>
           <w:szCs w:val="20"/>
-          <w:rtl w:val="0"/>
-          <w:lang w:val="en-US"/>
-        </w:rPr>
-        <w:t>Integration:</w:t>
-      </w:r>
-      <w:r>
-        <w:rPr>
-          <w:rFonts w:ascii="Arial" w:hAnsi="Arial"/>
-          <w:sz w:val="20"/>
-          <w:szCs w:val="20"/>
-          <w:rtl w:val="0"/>
-          <w:lang w:val="en-US"/>
-        </w:rPr>
-        <w:t xml:space="preserve">Implement connectors to integrate OnBase with other </w:t>
-      </w:r>
-      <w:r>
-        <w:rPr>
-          <w:rFonts w:ascii="Arial" w:hAnsi="Arial"/>
-          <w:sz w:val="20"/>
-          <w:szCs w:val="20"/>
-          <w:rtl w:val="0"/>
+          <w:lang w:val="en-US"/>
+        </w:rPr>
+        <w:t>Integration: Implement</w:t>
+      </w:r>
+      <w:r>
+        <w:rPr>
+          <w:rFonts w:ascii="Arial" w:hAnsi="Arial"/>
+          <w:sz w:val="20"/>
+          <w:szCs w:val="20"/>
+          <w:lang w:val="en-US"/>
+        </w:rPr>
+        <w:t xml:space="preserve"> connectors to integrate OnBase with other </w:t>
+      </w:r>
+      <w:proofErr w:type="spellStart"/>
+      <w:r>
+        <w:rPr>
+          <w:rFonts w:ascii="Arial" w:hAnsi="Arial"/>
+          <w:sz w:val="20"/>
+          <w:szCs w:val="20"/>
           <w:lang w:val="en-US"/>
         </w:rPr>
         <w:t>organisational</w:t>
       </w:r>
-      <w:r>
-        <w:rPr>
-          <w:rFonts w:ascii="Arial" w:hAnsi="Arial"/>
-          <w:sz w:val="20"/>
-          <w:szCs w:val="20"/>
-          <w:rtl w:val="0"/>
+      <w:proofErr w:type="spellEnd"/>
+      <w:r>
+        <w:rPr>
+          <w:rFonts w:ascii="Arial" w:hAnsi="Arial"/>
+          <w:sz w:val="20"/>
+          <w:szCs w:val="20"/>
           <w:lang w:val="en-US"/>
         </w:rPr>
         <w:t xml:space="preserve"> systems, both existing and new (e.g., I-Series, Webservices).</w:t>
       </w:r>
     </w:p>
-    <w:p>
+    <w:p xmlns:wp14="http://schemas.microsoft.com/office/word/2010/wordml" wp14:textId="77777777">
       <w:pPr>
         <w:pStyle w:val="Normal.0"/>
         <w:numPr>
@@ -1239,7 +1283,7 @@
         <w:t>Ensure data security through user access management and enforce compliance with industry standards.</w:t>
       </w:r>
     </w:p>
-    <w:p>
+    <w:p xmlns:wp14="http://schemas.microsoft.com/office/word/2010/wordml" wp14:textId="77777777">
       <w:pPr>
         <w:pStyle w:val="Normal.0"/>
         <w:numPr>
@@ -1294,7 +1338,7 @@
         <w:t>workflows, scripts, and integrations to ensure smooth operations.</w:t>
       </w:r>
     </w:p>
-    <w:p>
+    <w:p xmlns:wp14="http://schemas.microsoft.com/office/word/2010/wordml" wp14:textId="77777777">
       <w:pPr>
         <w:pStyle w:val="Normal.0"/>
         <w:numPr>
@@ -1329,7 +1373,7 @@
         <w:t>Retrieve documents, modify metadata, trigger workflow actions, and communicate with external systems to extend OnBase capabilities.</w:t>
       </w:r>
     </w:p>
-    <w:p>
+    <w:p xmlns:wp14="http://schemas.microsoft.com/office/word/2010/wordml" wp14:textId="77777777">
       <w:pPr>
         <w:pStyle w:val="Normal.0"/>
         <w:numPr>
@@ -1364,136 +1408,136 @@
         <w:t>Manage system upgrades, ensuring the OnBase platform is always up-to-date and functioning optimally.</w:t>
       </w:r>
     </w:p>
-    <w:p>
+    <w:p xmlns:wp14="http://schemas.microsoft.com/office/word/2010/wordml" wp14:textId="77777777">
       <w:pPr>
         <w:pStyle w:val="Normal.0"/>
         <w:bidi w:val="0"/>
         <w:ind w:left="0" w:right="0" w:firstLine="0"/>
         <w:jc w:val="both"/>
         <w:rPr>
-          <w:rFonts w:ascii="Arial" w:cs="Arial" w:hAnsi="Arial" w:eastAsia="Arial"/>
-          <w:sz w:val="20"/>
-          <w:szCs w:val="20"/>
-          <w:rtl w:val="0"/>
-          <w:lang w:val="en-US"/>
-        </w:rPr>
-      </w:pPr>
-    </w:p>
-    <w:p>
+          <w:rFonts w:ascii="Arial" w:hAnsi="Arial" w:eastAsia="Arial" w:cs="Arial"/>
+          <w:sz w:val="20"/>
+          <w:szCs w:val="20"/>
+          <w:rtl w:val="0"/>
+          <w:lang w:val="en-US"/>
+        </w:rPr>
+      </w:pPr>
+    </w:p>
+    <w:p xmlns:wp14="http://schemas.microsoft.com/office/word/2010/wordml" wp14:textId="77777777">
       <w:pPr>
         <w:pStyle w:val="Normal.0"/>
         <w:bidi w:val="0"/>
         <w:ind w:left="0" w:right="0" w:firstLine="0"/>
         <w:jc w:val="both"/>
         <w:rPr>
-          <w:rFonts w:ascii="Arial" w:cs="Arial" w:hAnsi="Arial" w:eastAsia="Arial"/>
-          <w:sz w:val="20"/>
-          <w:szCs w:val="20"/>
-          <w:rtl w:val="0"/>
-          <w:lang w:val="en-US"/>
-        </w:rPr>
-      </w:pPr>
-    </w:p>
-    <w:p>
+          <w:rFonts w:ascii="Arial" w:hAnsi="Arial" w:eastAsia="Arial" w:cs="Arial"/>
+          <w:sz w:val="20"/>
+          <w:szCs w:val="20"/>
+          <w:rtl w:val="0"/>
+          <w:lang w:val="en-US"/>
+        </w:rPr>
+      </w:pPr>
+    </w:p>
+    <w:p xmlns:wp14="http://schemas.microsoft.com/office/word/2010/wordml" wp14:textId="77777777">
       <w:pPr>
         <w:pStyle w:val="Normal.0"/>
         <w:bidi w:val="0"/>
         <w:ind w:left="0" w:right="0" w:firstLine="0"/>
         <w:jc w:val="both"/>
         <w:rPr>
-          <w:rFonts w:ascii="Arial" w:cs="Arial" w:hAnsi="Arial" w:eastAsia="Arial"/>
-          <w:b w:val="1"/>
-          <w:bCs w:val="1"/>
-          <w:sz w:val="20"/>
-          <w:szCs w:val="20"/>
-          <w:rtl w:val="0"/>
-          <w:lang w:val="en-US"/>
-        </w:rPr>
-      </w:pPr>
-    </w:p>
-    <w:p>
-      <w:pPr>
-        <w:pStyle w:val="Normal.0"/>
-        <w:rPr>
-          <w:rFonts w:ascii="Arial" w:cs="Arial" w:hAnsi="Arial" w:eastAsia="Arial"/>
-          <w:b w:val="1"/>
-          <w:bCs w:val="1"/>
-          <w:sz w:val="20"/>
-          <w:szCs w:val="20"/>
-          <w:lang w:val="en-US"/>
-        </w:rPr>
-      </w:pPr>
-    </w:p>
-    <w:p>
-      <w:pPr>
-        <w:pStyle w:val="Normal.0"/>
-        <w:rPr>
-          <w:rFonts w:ascii="Arial" w:cs="Arial" w:hAnsi="Arial" w:eastAsia="Arial"/>
-          <w:b w:val="1"/>
-          <w:bCs w:val="1"/>
-          <w:sz w:val="20"/>
-          <w:szCs w:val="20"/>
-          <w:lang w:val="en-US"/>
-        </w:rPr>
-      </w:pPr>
-    </w:p>
-    <w:p>
-      <w:pPr>
-        <w:pStyle w:val="Normal.0"/>
-        <w:rPr>
-          <w:rFonts w:ascii="Arial" w:cs="Arial" w:hAnsi="Arial" w:eastAsia="Arial"/>
-          <w:b w:val="1"/>
-          <w:bCs w:val="1"/>
-          <w:sz w:val="20"/>
-          <w:szCs w:val="20"/>
-          <w:lang w:val="en-US"/>
-        </w:rPr>
-      </w:pPr>
-    </w:p>
-    <w:p>
-      <w:pPr>
-        <w:pStyle w:val="Normal.0"/>
-        <w:rPr>
-          <w:rFonts w:ascii="Arial" w:cs="Arial" w:hAnsi="Arial" w:eastAsia="Arial"/>
-          <w:b w:val="1"/>
-          <w:bCs w:val="1"/>
-          <w:sz w:val="20"/>
-          <w:szCs w:val="20"/>
-          <w:lang w:val="en-US"/>
-        </w:rPr>
-      </w:pPr>
-    </w:p>
-    <w:p>
-      <w:pPr>
-        <w:pStyle w:val="Normal.0"/>
-        <w:rPr>
-          <w:rFonts w:ascii="Arial" w:cs="Arial" w:hAnsi="Arial" w:eastAsia="Arial"/>
-          <w:b w:val="1"/>
-          <w:bCs w:val="1"/>
-          <w:sz w:val="20"/>
-          <w:szCs w:val="20"/>
-          <w:lang w:val="en-US"/>
-        </w:rPr>
-      </w:pPr>
-    </w:p>
-    <w:p>
-      <w:pPr>
-        <w:pStyle w:val="Normal.0"/>
-        <w:rPr>
-          <w:rFonts w:ascii="Arial" w:cs="Arial" w:hAnsi="Arial" w:eastAsia="Arial"/>
-          <w:b w:val="1"/>
-          <w:bCs w:val="1"/>
-          <w:sz w:val="20"/>
-          <w:szCs w:val="20"/>
-          <w:lang w:val="en-US"/>
-        </w:rPr>
-      </w:pPr>
-    </w:p>
-    <w:p>
-      <w:pPr>
-        <w:pStyle w:val="Normal.0"/>
-        <w:rPr>
-          <w:rFonts w:ascii="Arial" w:cs="Arial" w:hAnsi="Arial" w:eastAsia="Arial"/>
+          <w:rFonts w:ascii="Arial" w:hAnsi="Arial" w:eastAsia="Arial" w:cs="Arial"/>
+          <w:b w:val="1"/>
+          <w:bCs w:val="1"/>
+          <w:sz w:val="20"/>
+          <w:szCs w:val="20"/>
+          <w:rtl w:val="0"/>
+          <w:lang w:val="en-US"/>
+        </w:rPr>
+      </w:pPr>
+    </w:p>
+    <w:p xmlns:wp14="http://schemas.microsoft.com/office/word/2010/wordml" wp14:textId="77777777">
+      <w:pPr>
+        <w:pStyle w:val="Normal.0"/>
+        <w:rPr>
+          <w:rFonts w:ascii="Arial" w:hAnsi="Arial" w:eastAsia="Arial" w:cs="Arial"/>
+          <w:b w:val="1"/>
+          <w:bCs w:val="1"/>
+          <w:sz w:val="20"/>
+          <w:szCs w:val="20"/>
+          <w:lang w:val="en-US"/>
+        </w:rPr>
+      </w:pPr>
+    </w:p>
+    <w:p xmlns:wp14="http://schemas.microsoft.com/office/word/2010/wordml" wp14:textId="77777777">
+      <w:pPr>
+        <w:pStyle w:val="Normal.0"/>
+        <w:rPr>
+          <w:rFonts w:ascii="Arial" w:hAnsi="Arial" w:eastAsia="Arial" w:cs="Arial"/>
+          <w:b w:val="1"/>
+          <w:bCs w:val="1"/>
+          <w:sz w:val="20"/>
+          <w:szCs w:val="20"/>
+          <w:lang w:val="en-US"/>
+        </w:rPr>
+      </w:pPr>
+    </w:p>
+    <w:p xmlns:wp14="http://schemas.microsoft.com/office/word/2010/wordml" wp14:textId="77777777">
+      <w:pPr>
+        <w:pStyle w:val="Normal.0"/>
+        <w:rPr>
+          <w:rFonts w:ascii="Arial" w:hAnsi="Arial" w:eastAsia="Arial" w:cs="Arial"/>
+          <w:b w:val="1"/>
+          <w:bCs w:val="1"/>
+          <w:sz w:val="20"/>
+          <w:szCs w:val="20"/>
+          <w:lang w:val="en-US"/>
+        </w:rPr>
+      </w:pPr>
+    </w:p>
+    <w:p xmlns:wp14="http://schemas.microsoft.com/office/word/2010/wordml" wp14:textId="77777777">
+      <w:pPr>
+        <w:pStyle w:val="Normal.0"/>
+        <w:rPr>
+          <w:rFonts w:ascii="Arial" w:hAnsi="Arial" w:eastAsia="Arial" w:cs="Arial"/>
+          <w:b w:val="1"/>
+          <w:bCs w:val="1"/>
+          <w:sz w:val="20"/>
+          <w:szCs w:val="20"/>
+          <w:lang w:val="en-US"/>
+        </w:rPr>
+      </w:pPr>
+    </w:p>
+    <w:p xmlns:wp14="http://schemas.microsoft.com/office/word/2010/wordml" wp14:textId="77777777">
+      <w:pPr>
+        <w:pStyle w:val="Normal.0"/>
+        <w:rPr>
+          <w:rFonts w:ascii="Arial" w:hAnsi="Arial" w:eastAsia="Arial" w:cs="Arial"/>
+          <w:b w:val="1"/>
+          <w:bCs w:val="1"/>
+          <w:sz w:val="20"/>
+          <w:szCs w:val="20"/>
+          <w:lang w:val="en-US"/>
+        </w:rPr>
+      </w:pPr>
+    </w:p>
+    <w:p xmlns:wp14="http://schemas.microsoft.com/office/word/2010/wordml" wp14:textId="77777777">
+      <w:pPr>
+        <w:pStyle w:val="Normal.0"/>
+        <w:rPr>
+          <w:rFonts w:ascii="Arial" w:hAnsi="Arial" w:eastAsia="Arial" w:cs="Arial"/>
+          <w:b w:val="1"/>
+          <w:bCs w:val="1"/>
+          <w:sz w:val="20"/>
+          <w:szCs w:val="20"/>
+          <w:lang w:val="en-US"/>
+        </w:rPr>
+      </w:pPr>
+    </w:p>
+    <w:p xmlns:wp14="http://schemas.microsoft.com/office/word/2010/wordml" wp14:textId="77777777">
+      <w:pPr>
+        <w:pStyle w:val="Normal.0"/>
+        <w:rPr>
+          <w:rFonts w:ascii="Arial" w:hAnsi="Arial" w:eastAsia="Arial" w:cs="Arial"/>
           <w:b w:val="1"/>
           <w:bCs w:val="1"/>
           <w:sz w:val="20"/>
@@ -1504,52 +1548,52 @@
           <w:type w:val="continuous"/>
           <w:pgSz w:w="11900" w:h="16840" w:orient="portrait"/>
           <w:pgMar w:top="1440" w:right="701" w:bottom="1440" w:left="993" w:header="708" w:footer="708"/>
-          <w:cols w:space="708" w:num="2" w:equalWidth="1"/>
+          <w:cols w:equalWidth="1" w:space="708" w:num="2"/>
           <w:bidi w:val="0"/>
         </w:sectPr>
       </w:pPr>
       <w:r>
         <w:rPr>
-          <w:rFonts w:ascii="Arial" w:cs="Arial" w:hAnsi="Arial" w:eastAsia="Arial"/>
-          <w:b w:val="1"/>
-          <w:bCs w:val="1"/>
-          <w:sz w:val="20"/>
-          <w:szCs w:val="20"/>
-          <w:lang w:val="en-US"/>
-        </w:rPr>
-      </w:r>
-    </w:p>
-    <w:p>
-      <w:pPr>
-        <w:pStyle w:val="Normal.0"/>
-        <w:rPr>
-          <w:rFonts w:ascii="Arial" w:cs="Arial" w:hAnsi="Arial" w:eastAsia="Arial"/>
-          <w:b w:val="1"/>
-          <w:bCs w:val="1"/>
-          <w:sz w:val="20"/>
-          <w:szCs w:val="20"/>
-          <w:lang w:val="en-US"/>
-        </w:rPr>
-      </w:pPr>
-    </w:p>
-    <w:p>
-      <w:pPr>
-        <w:pStyle w:val="Normal.0"/>
-        <w:rPr>
-          <w:rFonts w:ascii="Arial" w:cs="Arial" w:hAnsi="Arial" w:eastAsia="Arial"/>
-          <w:b w:val="1"/>
-          <w:bCs w:val="1"/>
-          <w:sz w:val="20"/>
-          <w:szCs w:val="20"/>
-          <w:lang w:val="en-US"/>
-        </w:rPr>
-      </w:pPr>
-    </w:p>
-    <w:p>
-      <w:pPr>
-        <w:pStyle w:val="Normal.0"/>
-        <w:rPr>
-          <w:rFonts w:ascii="Arial" w:cs="Arial" w:hAnsi="Arial" w:eastAsia="Arial"/>
+          <w:rFonts w:ascii="Arial" w:hAnsi="Arial" w:eastAsia="Arial" w:cs="Arial"/>
+          <w:b w:val="1"/>
+          <w:bCs w:val="1"/>
+          <w:sz w:val="20"/>
+          <w:szCs w:val="20"/>
+          <w:lang w:val="en-US"/>
+        </w:rPr>
+      </w:r>
+    </w:p>
+    <w:p xmlns:wp14="http://schemas.microsoft.com/office/word/2010/wordml" wp14:textId="77777777">
+      <w:pPr>
+        <w:pStyle w:val="Normal.0"/>
+        <w:rPr>
+          <w:rFonts w:ascii="Arial" w:hAnsi="Arial" w:eastAsia="Arial" w:cs="Arial"/>
+          <w:b w:val="1"/>
+          <w:bCs w:val="1"/>
+          <w:sz w:val="20"/>
+          <w:szCs w:val="20"/>
+          <w:lang w:val="en-US"/>
+        </w:rPr>
+      </w:pPr>
+    </w:p>
+    <w:p xmlns:wp14="http://schemas.microsoft.com/office/word/2010/wordml" wp14:textId="77777777">
+      <w:pPr>
+        <w:pStyle w:val="Normal.0"/>
+        <w:rPr>
+          <w:rFonts w:ascii="Arial" w:hAnsi="Arial" w:eastAsia="Arial" w:cs="Arial"/>
+          <w:b w:val="1"/>
+          <w:bCs w:val="1"/>
+          <w:sz w:val="20"/>
+          <w:szCs w:val="20"/>
+          <w:lang w:val="en-US"/>
+        </w:rPr>
+      </w:pPr>
+    </w:p>
+    <w:p xmlns:wp14="http://schemas.microsoft.com/office/word/2010/wordml" wp14:textId="77777777">
+      <w:pPr>
+        <w:pStyle w:val="Normal.0"/>
+        <w:rPr>
+          <w:rFonts w:ascii="Arial" w:hAnsi="Arial" w:eastAsia="Arial" w:cs="Arial"/>
           <w:b w:val="1"/>
           <w:bCs w:val="1"/>
           <w:outline w:val="0"/>
@@ -1586,11 +1630,11 @@
         <w:t xml:space="preserve">                                       </w:t>
       </w:r>
     </w:p>
-    <w:p>
-      <w:pPr>
-        <w:pStyle w:val="Normal.0"/>
-        <w:rPr>
-          <w:rFonts w:ascii="Arial" w:cs="Arial" w:hAnsi="Arial" w:eastAsia="Arial"/>
+    <w:p xmlns:wp14="http://schemas.microsoft.com/office/word/2010/wordml" wp14:textId="77777777">
+      <w:pPr>
+        <w:pStyle w:val="Normal.0"/>
+        <w:rPr>
+          <w:rFonts w:ascii="Arial" w:hAnsi="Arial" w:eastAsia="Arial" w:cs="Arial"/>
           <w:b w:val="1"/>
           <w:bCs w:val="1"/>
           <w:sz w:val="20"/>
@@ -1623,25 +1667,25 @@
         <w:t>July 2020</w:t>
       </w:r>
     </w:p>
-    <w:p>
-      <w:pPr>
-        <w:pStyle w:val="Normal.0"/>
-        <w:rPr>
-          <w:rFonts w:ascii="Arial" w:cs="Arial" w:hAnsi="Arial" w:eastAsia="Arial"/>
-          <w:b w:val="1"/>
-          <w:bCs w:val="1"/>
-          <w:sz w:val="20"/>
-          <w:szCs w:val="20"/>
-          <w:lang w:val="en-US"/>
-        </w:rPr>
-      </w:pPr>
-    </w:p>
-    <w:p>
+    <w:p xmlns:wp14="http://schemas.microsoft.com/office/word/2010/wordml" wp14:textId="77777777">
+      <w:pPr>
+        <w:pStyle w:val="Normal.0"/>
+        <w:rPr>
+          <w:rFonts w:ascii="Arial" w:hAnsi="Arial" w:eastAsia="Arial" w:cs="Arial"/>
+          <w:b w:val="1"/>
+          <w:bCs w:val="1"/>
+          <w:sz w:val="20"/>
+          <w:szCs w:val="20"/>
+          <w:lang w:val="en-US"/>
+        </w:rPr>
+      </w:pPr>
+    </w:p>
+    <w:p xmlns:wp14="http://schemas.microsoft.com/office/word/2010/wordml" wp14:textId="77777777">
       <w:pPr>
         <w:pStyle w:val="Normal.0"/>
         <w:jc w:val="center"/>
         <w:rPr>
-          <w:rFonts w:ascii="Arial" w:cs="Arial" w:hAnsi="Arial" w:eastAsia="Arial"/>
+          <w:rFonts w:ascii="Arial" w:hAnsi="Arial" w:eastAsia="Arial" w:cs="Arial"/>
           <w:b w:val="1"/>
           <w:bCs w:val="1"/>
           <w:sz w:val="20"/>
@@ -1662,12 +1706,12 @@
         <w:t>Company: Ageas Insurance Ltd</w:t>
       </w:r>
     </w:p>
-    <w:p>
+    <w:p xmlns:wp14="http://schemas.microsoft.com/office/word/2010/wordml" wp14:textId="77777777">
       <w:pPr>
         <w:pStyle w:val="Normal.0"/>
         <w:jc w:val="center"/>
         <w:rPr>
-          <w:rFonts w:ascii="Arial" w:cs="Arial" w:hAnsi="Arial" w:eastAsia="Arial"/>
+          <w:rFonts w:ascii="Arial" w:hAnsi="Arial" w:eastAsia="Arial" w:cs="Arial"/>
           <w:b w:val="1"/>
           <w:bCs w:val="1"/>
           <w:sz w:val="20"/>
@@ -1688,11 +1732,11 @@
         <w:t>Role: Learning and Development Officer</w:t>
       </w:r>
     </w:p>
-    <w:p>
-      <w:pPr>
-        <w:pStyle w:val="Normal.0"/>
-        <w:rPr>
-          <w:rFonts w:ascii="Arial" w:cs="Arial" w:hAnsi="Arial" w:eastAsia="Arial"/>
+    <w:p xmlns:wp14="http://schemas.microsoft.com/office/word/2010/wordml" wp14:textId="77777777">
+      <w:pPr>
+        <w:pStyle w:val="Normal.0"/>
+        <w:rPr>
+          <w:rFonts w:ascii="Arial" w:hAnsi="Arial" w:eastAsia="Arial" w:cs="Arial"/>
           <w:b w:val="1"/>
           <w:bCs w:val="1"/>
           <w:sz w:val="20"/>
@@ -1733,22 +1777,21 @@
         <w:t>:</w:t>
       </w:r>
     </w:p>
-    <w:p>
-      <w:pPr>
-        <w:pStyle w:val="Normal.0"/>
-        <w:rPr>
-          <w:rFonts w:ascii="Arial" w:cs="Arial" w:hAnsi="Arial" w:eastAsia="Arial"/>
-          <w:sz w:val="20"/>
-          <w:szCs w:val="20"/>
-          <w:lang w:val="en-US"/>
-        </w:rPr>
-      </w:pPr>
-      <w:r>
-        <w:rPr>
-          <w:rFonts w:ascii="Arial" w:hAnsi="Arial"/>
-          <w:sz w:val="20"/>
-          <w:szCs w:val="20"/>
-          <w:rtl w:val="0"/>
+    <w:p xmlns:wp14="http://schemas.microsoft.com/office/word/2010/wordml" wp14:textId="3E5A4ED1">
+      <w:pPr>
+        <w:pStyle w:val="Normal.0"/>
+        <w:rPr>
+          <w:rFonts w:ascii="Arial" w:hAnsi="Arial" w:eastAsia="Arial" w:cs="Arial"/>
+          <w:sz w:val="20"/>
+          <w:szCs w:val="20"/>
+          <w:lang w:val="en-US"/>
+        </w:rPr>
+      </w:pPr>
+      <w:r>
+        <w:rPr>
+          <w:rFonts w:ascii="Arial" w:hAnsi="Arial"/>
+          <w:sz w:val="20"/>
+          <w:szCs w:val="20"/>
           <w:lang w:val="en-US"/>
         </w:rPr>
         <w:t xml:space="preserve">I </w:t>
@@ -1758,17 +1801,24 @@
           <w:rFonts w:ascii="Arial" w:hAnsi="Arial"/>
           <w:sz w:val="20"/>
           <w:szCs w:val="20"/>
-          <w:rtl w:val="0"/>
-          <w:lang w:val="en-US"/>
-        </w:rPr>
-        <w:t xml:space="preserve">was responsible for </w:t>
-      </w:r>
-      <w:r>
-        <w:rPr>
-          <w:rFonts w:ascii="Arial" w:hAnsi="Arial"/>
-          <w:sz w:val="20"/>
-          <w:szCs w:val="20"/>
-          <w:rtl w:val="0"/>
+          <w:lang w:val="en-US"/>
+        </w:rPr>
+        <w:t>was responsible for</w:t>
+      </w:r>
+      <w:r>
+        <w:rPr>
+          <w:rFonts w:ascii="Arial" w:hAnsi="Arial"/>
+          <w:sz w:val="20"/>
+          <w:szCs w:val="20"/>
+          <w:lang w:val="en-US"/>
+        </w:rPr>
+        <w:t xml:space="preserve"> </w:t>
+      </w:r>
+      <w:r>
+        <w:rPr>
+          <w:rFonts w:ascii="Arial" w:hAnsi="Arial"/>
+          <w:sz w:val="20"/>
+          <w:szCs w:val="20"/>
           <w:lang w:val="en-US"/>
         </w:rPr>
         <w:t>creat</w:t>
@@ -1778,7 +1828,6 @@
           <w:rFonts w:ascii="Arial" w:hAnsi="Arial"/>
           <w:sz w:val="20"/>
           <w:szCs w:val="20"/>
-          <w:rtl w:val="0"/>
           <w:lang w:val="en-US"/>
         </w:rPr>
         <w:t>ing</w:t>
@@ -1788,7 +1837,6 @@
           <w:rFonts w:ascii="Arial" w:hAnsi="Arial"/>
           <w:sz w:val="20"/>
           <w:szCs w:val="20"/>
-          <w:rtl w:val="0"/>
           <w:lang w:val="en-US"/>
         </w:rPr>
         <w:t xml:space="preserve"> and deliver</w:t>
@@ -1798,7 +1846,6 @@
           <w:rFonts w:ascii="Arial" w:hAnsi="Arial"/>
           <w:sz w:val="20"/>
           <w:szCs w:val="20"/>
-          <w:rtl w:val="0"/>
           <w:lang w:val="en-US"/>
         </w:rPr>
         <w:t>ing</w:t>
@@ -1808,17 +1855,33 @@
           <w:rFonts w:ascii="Arial" w:hAnsi="Arial"/>
           <w:sz w:val="20"/>
           <w:szCs w:val="20"/>
-          <w:rtl w:val="0"/>
-          <w:lang w:val="en-US"/>
-        </w:rPr>
-        <w:t xml:space="preserve"> training programmes that </w:t>
-      </w:r>
-      <w:r>
-        <w:rPr>
-          <w:rFonts w:ascii="Arial" w:hAnsi="Arial"/>
-          <w:sz w:val="20"/>
-          <w:szCs w:val="20"/>
-          <w:rtl w:val="0"/>
+          <w:lang w:val="en-US"/>
+        </w:rPr>
+        <w:t xml:space="preserve"> training </w:t>
+      </w:r>
+      <w:r>
+        <w:rPr>
+          <w:rFonts w:ascii="Arial" w:hAnsi="Arial"/>
+          <w:sz w:val="20"/>
+          <w:szCs w:val="20"/>
+          <w:lang w:val="en-US"/>
+        </w:rPr>
+        <w:t>programs</w:t>
+      </w:r>
+      <w:r>
+        <w:rPr>
+          <w:rFonts w:ascii="Arial" w:hAnsi="Arial"/>
+          <w:sz w:val="20"/>
+          <w:szCs w:val="20"/>
+          <w:lang w:val="en-US"/>
+        </w:rPr>
+        <w:t xml:space="preserve"> that </w:t>
+      </w:r>
+      <w:r>
+        <w:rPr>
+          <w:rFonts w:ascii="Arial" w:hAnsi="Arial"/>
+          <w:sz w:val="20"/>
+          <w:szCs w:val="20"/>
           <w:lang w:val="en-US"/>
         </w:rPr>
         <w:t>were</w:t>
@@ -1828,17 +1891,15 @@
           <w:rFonts w:ascii="Arial" w:hAnsi="Arial"/>
           <w:sz w:val="20"/>
           <w:szCs w:val="20"/>
-          <w:rtl w:val="0"/>
-          <w:lang w:val="en-US"/>
-        </w:rPr>
-        <w:t xml:space="preserve"> based around a blended approach to learning to ensure trainees receive an understanding of the core elements of their role and the fundamental believes of the company.  My training programmes </w:t>
-      </w:r>
-      <w:r>
-        <w:rPr>
-          <w:rFonts w:ascii="Arial" w:hAnsi="Arial"/>
-          <w:sz w:val="20"/>
-          <w:szCs w:val="20"/>
-          <w:rtl w:val="0"/>
+          <w:lang w:val="en-US"/>
+        </w:rPr>
+        <w:t xml:space="preserve"> based around a blended approach to learning to ensure trainees receive an understanding of the core elements of their role and the fundamental believes of the company.  My training programs </w:t>
+      </w:r>
+      <w:r>
+        <w:rPr>
+          <w:rFonts w:ascii="Arial" w:hAnsi="Arial"/>
+          <w:sz w:val="20"/>
+          <w:szCs w:val="20"/>
           <w:lang w:val="en-US"/>
         </w:rPr>
         <w:t>were</w:t>
@@ -1848,17 +1909,15 @@
           <w:rFonts w:ascii="Arial" w:hAnsi="Arial"/>
           <w:sz w:val="20"/>
           <w:szCs w:val="20"/>
-          <w:rtl w:val="0"/>
-          <w:lang w:val="en-US"/>
-        </w:rPr>
-        <w:t xml:space="preserve"> a combination of class led sessions and E-Learning programmes.  Through the concept of </w:t>
-      </w:r>
-      <w:r>
-        <w:rPr>
-          <w:rFonts w:ascii="Arial" w:hAnsi="Arial" w:hint="default"/>
-          <w:sz w:val="20"/>
-          <w:szCs w:val="20"/>
-          <w:rtl w:val="0"/>
+          <w:lang w:val="en-US"/>
+        </w:rPr>
+        <w:t xml:space="preserve"> a combination of class led sessions and E-Learning programs.  Through the concept of </w:t>
+      </w:r>
+      <w:r>
+        <w:rPr>
+          <w:rFonts w:ascii="Arial" w:hAnsi="Arial"/>
+          <w:sz w:val="20"/>
+          <w:szCs w:val="20"/>
           <w:lang w:val="en-US"/>
         </w:rPr>
         <w:t>‘</w:t>
@@ -1868,17 +1927,15 @@
           <w:rFonts w:ascii="Arial" w:hAnsi="Arial"/>
           <w:sz w:val="20"/>
           <w:szCs w:val="20"/>
-          <w:rtl w:val="0"/>
           <w:lang w:val="en-US"/>
         </w:rPr>
         <w:t>gamification</w:t>
       </w:r>
       <w:r>
         <w:rPr>
-          <w:rFonts w:ascii="Arial" w:hAnsi="Arial" w:hint="default"/>
-          <w:sz w:val="20"/>
-          <w:szCs w:val="20"/>
-          <w:rtl w:val="0"/>
+          <w:rFonts w:ascii="Arial" w:hAnsi="Arial"/>
+          <w:sz w:val="20"/>
+          <w:szCs w:val="20"/>
           <w:lang w:val="en-US"/>
         </w:rPr>
         <w:t xml:space="preserve">’ </w:t>
@@ -1888,7 +1945,6 @@
           <w:rFonts w:ascii="Arial" w:hAnsi="Arial"/>
           <w:sz w:val="20"/>
           <w:szCs w:val="20"/>
-          <w:rtl w:val="0"/>
           <w:lang w:val="en-US"/>
         </w:rPr>
         <w:t>I create</w:t>
@@ -1898,7 +1954,6 @@
           <w:rFonts w:ascii="Arial" w:hAnsi="Arial"/>
           <w:sz w:val="20"/>
           <w:szCs w:val="20"/>
-          <w:rtl w:val="0"/>
           <w:lang w:val="en-US"/>
         </w:rPr>
         <w:t>d</w:t>
@@ -1908,17 +1963,15 @@
           <w:rFonts w:ascii="Arial" w:hAnsi="Arial"/>
           <w:sz w:val="20"/>
           <w:szCs w:val="20"/>
-          <w:rtl w:val="0"/>
-          <w:lang w:val="en-US"/>
-        </w:rPr>
-        <w:t xml:space="preserve"> e-learning courses that cater to different learning styles, programmes that </w:t>
-      </w:r>
-      <w:r>
-        <w:rPr>
-          <w:rFonts w:ascii="Arial" w:hAnsi="Arial"/>
-          <w:sz w:val="20"/>
-          <w:szCs w:val="20"/>
-          <w:rtl w:val="0"/>
+          <w:lang w:val="en-US"/>
+        </w:rPr>
+        <w:t xml:space="preserve"> e-learning courses that cater to different learning styles, programs that </w:t>
+      </w:r>
+      <w:r>
+        <w:rPr>
+          <w:rFonts w:ascii="Arial" w:hAnsi="Arial"/>
+          <w:sz w:val="20"/>
+          <w:szCs w:val="20"/>
           <w:lang w:val="en-US"/>
         </w:rPr>
         <w:t>were</w:t>
@@ -1928,17 +1981,24 @@
           <w:rFonts w:ascii="Arial" w:hAnsi="Arial"/>
           <w:sz w:val="20"/>
           <w:szCs w:val="20"/>
-          <w:rtl w:val="0"/>
-          <w:lang w:val="en-US"/>
-        </w:rPr>
-        <w:t xml:space="preserve"> mindful of the learning cohort.  Through analysis, I determine</w:t>
-      </w:r>
-      <w:r>
-        <w:rPr>
-          <w:rFonts w:ascii="Arial" w:hAnsi="Arial"/>
-          <w:sz w:val="20"/>
-          <w:szCs w:val="20"/>
-          <w:rtl w:val="0"/>
+          <w:lang w:val="en-US"/>
+        </w:rPr>
+        <w:t xml:space="preserve"> mindful of the learning cohort.  Through analysis, I </w:t>
+      </w:r>
+      <w:r>
+        <w:rPr>
+          <w:rFonts w:ascii="Arial" w:hAnsi="Arial"/>
+          <w:sz w:val="20"/>
+          <w:szCs w:val="20"/>
+          <w:lang w:val="en-US"/>
+        </w:rPr>
+        <w:t>determine</w:t>
+      </w:r>
+      <w:r>
+        <w:rPr>
+          <w:rFonts w:ascii="Arial" w:hAnsi="Arial"/>
+          <w:sz w:val="20"/>
+          <w:szCs w:val="20"/>
           <w:lang w:val="en-US"/>
         </w:rPr>
         <w:t>d</w:t>
@@ -1948,7 +2008,6 @@
           <w:rFonts w:ascii="Arial" w:hAnsi="Arial"/>
           <w:sz w:val="20"/>
           <w:szCs w:val="20"/>
-          <w:rtl w:val="0"/>
           <w:lang w:val="en-US"/>
         </w:rPr>
         <w:t xml:space="preserve"> learning needs, I then design</w:t>
@@ -1958,7 +2017,6 @@
           <w:rFonts w:ascii="Arial" w:hAnsi="Arial"/>
           <w:sz w:val="20"/>
           <w:szCs w:val="20"/>
-          <w:rtl w:val="0"/>
           <w:lang w:val="en-US"/>
         </w:rPr>
         <w:t>ed</w:t>
@@ -1968,17 +2026,24 @@
           <w:rFonts w:ascii="Arial" w:hAnsi="Arial"/>
           <w:sz w:val="20"/>
           <w:szCs w:val="20"/>
-          <w:rtl w:val="0"/>
-          <w:lang w:val="en-US"/>
-        </w:rPr>
-        <w:t>, deliver</w:t>
-      </w:r>
-      <w:r>
-        <w:rPr>
-          <w:rFonts w:ascii="Arial" w:hAnsi="Arial"/>
-          <w:sz w:val="20"/>
-          <w:szCs w:val="20"/>
-          <w:rtl w:val="0"/>
+          <w:lang w:val="en-US"/>
+        </w:rPr>
+        <w:t xml:space="preserve">, </w:t>
+      </w:r>
+      <w:r>
+        <w:rPr>
+          <w:rFonts w:ascii="Arial" w:hAnsi="Arial"/>
+          <w:sz w:val="20"/>
+          <w:szCs w:val="20"/>
+          <w:lang w:val="en-US"/>
+        </w:rPr>
+        <w:t>deliver</w:t>
+      </w:r>
+      <w:r>
+        <w:rPr>
+          <w:rFonts w:ascii="Arial" w:hAnsi="Arial"/>
+          <w:sz w:val="20"/>
+          <w:szCs w:val="20"/>
           <w:lang w:val="en-US"/>
         </w:rPr>
         <w:t>ed</w:t>
@@ -1988,7 +2053,6 @@
           <w:rFonts w:ascii="Arial" w:hAnsi="Arial"/>
           <w:sz w:val="20"/>
           <w:szCs w:val="20"/>
-          <w:rtl w:val="0"/>
           <w:lang w:val="en-US"/>
         </w:rPr>
         <w:t xml:space="preserve"> and evaluate</w:t>
@@ -1998,7 +2062,6 @@
           <w:rFonts w:ascii="Arial" w:hAnsi="Arial"/>
           <w:sz w:val="20"/>
           <w:szCs w:val="20"/>
-          <w:rtl w:val="0"/>
           <w:lang w:val="en-US"/>
         </w:rPr>
         <w:t>d</w:t>
@@ -2008,17 +2071,34 @@
           <w:rFonts w:ascii="Arial" w:hAnsi="Arial"/>
           <w:sz w:val="20"/>
           <w:szCs w:val="20"/>
-          <w:rtl w:val="0"/>
-          <w:lang w:val="en-US"/>
-        </w:rPr>
-        <w:t xml:space="preserve"> training programmes to ensure there is a result on investment.</w:t>
-      </w:r>
-    </w:p>
-    <w:p>
-      <w:pPr>
-        <w:pStyle w:val="Normal.0"/>
-        <w:rPr>
-          <w:rFonts w:ascii="Arial" w:cs="Arial" w:hAnsi="Arial" w:eastAsia="Arial"/>
+          <w:lang w:val="en-US"/>
+        </w:rPr>
+        <w:t xml:space="preserve"> training </w:t>
+      </w:r>
+      <w:r>
+        <w:rPr>
+          <w:rFonts w:ascii="Arial" w:hAnsi="Arial"/>
+          <w:sz w:val="20"/>
+          <w:szCs w:val="20"/>
+          <w:lang w:val="en-US"/>
+        </w:rPr>
+        <w:t>programs</w:t>
+      </w:r>
+      <w:r>
+        <w:rPr>
+          <w:rFonts w:ascii="Arial" w:hAnsi="Arial"/>
+          <w:sz w:val="20"/>
+          <w:szCs w:val="20"/>
+          <w:lang w:val="en-US"/>
+        </w:rPr>
+        <w:t xml:space="preserve"> to ensure there is a result on investment.</w:t>
+      </w:r>
+    </w:p>
+    <w:p xmlns:wp14="http://schemas.microsoft.com/office/word/2010/wordml" wp14:textId="77777777">
+      <w:pPr>
+        <w:pStyle w:val="Normal.0"/>
+        <w:rPr>
+          <w:rFonts w:ascii="Arial" w:hAnsi="Arial" w:eastAsia="Arial" w:cs="Arial"/>
           <w:sz w:val="20"/>
           <w:szCs w:val="20"/>
           <w:lang w:val="en-US"/>
@@ -2028,23 +2108,24 @@
           <w:pgSz w:w="11900" w:h="16840" w:orient="portrait"/>
           <w:pgMar w:top="1440" w:right="701" w:bottom="1440" w:left="993" w:header="708" w:footer="708"/>
           <w:bidi w:val="0"/>
+          <w:cols w:num="1"/>
         </w:sectPr>
       </w:pPr>
       <w:r>
         <w:rPr>
-          <w:rFonts w:ascii="Arial" w:cs="Arial" w:hAnsi="Arial" w:eastAsia="Arial"/>
-          <w:sz w:val="20"/>
-          <w:szCs w:val="20"/>
-          <w:lang w:val="en-US"/>
-        </w:rPr>
-      </w:r>
-    </w:p>
-    <w:p>
+          <w:rFonts w:ascii="Arial" w:hAnsi="Arial" w:eastAsia="Arial" w:cs="Arial"/>
+          <w:sz w:val="20"/>
+          <w:szCs w:val="20"/>
+          <w:lang w:val="en-US"/>
+        </w:rPr>
+      </w:r>
+    </w:p>
+    <w:p xmlns:wp14="http://schemas.microsoft.com/office/word/2010/wordml" wp14:textId="77777777">
       <w:pPr>
         <w:pStyle w:val="Normal.0"/>
         <w:jc w:val="both"/>
         <w:rPr>
-          <w:rFonts w:ascii="Arial" w:cs="Arial" w:hAnsi="Arial" w:eastAsia="Arial"/>
+          <w:rFonts w:ascii="Arial" w:hAnsi="Arial" w:eastAsia="Arial" w:cs="Arial"/>
           <w:b w:val="1"/>
           <w:bCs w:val="1"/>
           <w:outline w:val="0"/>
@@ -2081,12 +2162,12 @@
         <w:t>Key responsibilities</w:t>
       </w:r>
     </w:p>
-    <w:p>
+    <w:p xmlns:wp14="http://schemas.microsoft.com/office/word/2010/wordml" wp14:textId="77777777">
       <w:pPr>
         <w:pStyle w:val="Normal.0"/>
         <w:jc w:val="both"/>
         <w:rPr>
-          <w:rFonts w:ascii="Arial" w:cs="Arial" w:hAnsi="Arial" w:eastAsia="Arial"/>
+          <w:rFonts w:ascii="Arial" w:hAnsi="Arial" w:eastAsia="Arial" w:cs="Arial"/>
           <w:b w:val="1"/>
           <w:bCs w:val="1"/>
           <w:outline w:val="0"/>
@@ -2105,13 +2186,13 @@
           <w:type w:val="continuous"/>
           <w:pgSz w:w="11900" w:h="16840" w:orient="portrait"/>
           <w:pgMar w:top="1440" w:right="701" w:bottom="1440" w:left="993" w:header="708" w:footer="708"/>
-          <w:cols w:space="708" w:num="2" w:equalWidth="1"/>
+          <w:cols w:equalWidth="1" w:space="708" w:num="2"/>
           <w:bidi w:val="0"/>
         </w:sectPr>
       </w:pPr>
       <w:r>
         <w:rPr>
-          <w:rFonts w:ascii="Arial" w:cs="Arial" w:hAnsi="Arial" w:eastAsia="Arial"/>
+          <w:rFonts w:ascii="Arial" w:hAnsi="Arial" w:eastAsia="Arial" w:cs="Arial"/>
           <w:b w:val="1"/>
           <w:bCs w:val="1"/>
           <w:outline w:val="0"/>
@@ -2128,7 +2209,7 @@
         </w:rPr>
       </w:r>
     </w:p>
-    <w:p>
+    <w:p xmlns:wp14="http://schemas.microsoft.com/office/word/2010/wordml" wp14:textId="77777777">
       <w:pPr>
         <w:pStyle w:val="Normal.0"/>
         <w:numPr>
@@ -2157,7 +2238,7 @@
         <w:t>Stakeholder Management</w:t>
       </w:r>
     </w:p>
-    <w:p>
+    <w:p xmlns:wp14="http://schemas.microsoft.com/office/word/2010/wordml" wp14:textId="77777777">
       <w:pPr>
         <w:pStyle w:val="Normal.0"/>
         <w:numPr>
@@ -2186,7 +2267,7 @@
         <w:t>Project management</w:t>
       </w:r>
     </w:p>
-    <w:p>
+    <w:p xmlns:wp14="http://schemas.microsoft.com/office/word/2010/wordml" wp14:textId="77777777">
       <w:pPr>
         <w:pStyle w:val="Normal.0"/>
         <w:numPr>
@@ -2215,7 +2296,7 @@
         <w:t>Delivering motor claims training across 3 regional offices</w:t>
       </w:r>
     </w:p>
-    <w:p>
+    <w:p xmlns:wp14="http://schemas.microsoft.com/office/word/2010/wordml" wp14:textId="77777777">
       <w:pPr>
         <w:pStyle w:val="Normal.0"/>
         <w:numPr>
@@ -2244,7 +2325,7 @@
         <w:t>Design and delivery of training materials for classroom training</w:t>
       </w:r>
     </w:p>
-    <w:p>
+    <w:p xmlns:wp14="http://schemas.microsoft.com/office/word/2010/wordml" wp14:textId="77777777">
       <w:pPr>
         <w:pStyle w:val="Normal.0"/>
         <w:numPr>
@@ -2273,7 +2354,7 @@
         <w:t>Creating a storyboard, designing and delivering innovative E-learning packages through LMS</w:t>
       </w:r>
     </w:p>
-    <w:p>
+    <w:p xmlns:wp14="http://schemas.microsoft.com/office/word/2010/wordml" wp14:textId="77777777">
       <w:pPr>
         <w:pStyle w:val="Normal.0"/>
         <w:numPr>
@@ -2303,7 +2384,7 @@
       </w:r>
       <w:r>
         <w:rPr>
-          <w:rFonts w:ascii="Arial" w:hAnsi="Arial" w:hint="default"/>
+          <w:rFonts w:hint="default" w:ascii="Arial" w:hAnsi="Arial"/>
           <w:sz w:val="20"/>
           <w:szCs w:val="20"/>
           <w:rtl w:val="0"/>
@@ -2322,7 +2403,7 @@
         <w:t>s including Camtasia, Articulate storyline &amp; 360, LMS and Adobe Spark</w:t>
       </w:r>
     </w:p>
-    <w:p>
+    <w:p xmlns:wp14="http://schemas.microsoft.com/office/word/2010/wordml" wp14:textId="77777777">
       <w:pPr>
         <w:pStyle w:val="Normal.0"/>
         <w:numPr>
@@ -2351,7 +2432,7 @@
         <w:t>Planning and evaluating departments logistics</w:t>
       </w:r>
     </w:p>
-    <w:p>
+    <w:p xmlns:wp14="http://schemas.microsoft.com/office/word/2010/wordml" wp14:textId="77777777">
       <w:pPr>
         <w:pStyle w:val="Normal.0"/>
         <w:numPr>
@@ -2380,7 +2461,7 @@
         <w:t>Evaluating delivered solutions</w:t>
       </w:r>
     </w:p>
-    <w:p>
+    <w:p xmlns:wp14="http://schemas.microsoft.com/office/word/2010/wordml" wp14:textId="77777777">
       <w:pPr>
         <w:pStyle w:val="Normal.0"/>
         <w:numPr>
@@ -2409,7 +2490,7 @@
         <w:t>Process improvement and reducing failure demands</w:t>
       </w:r>
     </w:p>
-    <w:p>
+    <w:p xmlns:wp14="http://schemas.microsoft.com/office/word/2010/wordml" wp14:textId="77777777">
       <w:pPr>
         <w:pStyle w:val="Normal.0"/>
         <w:numPr>
@@ -2438,7 +2519,7 @@
         <w:t>Innovation and creativity in a competitive market</w:t>
       </w:r>
     </w:p>
-    <w:p>
+    <w:p xmlns:wp14="http://schemas.microsoft.com/office/word/2010/wordml" wp14:textId="77777777">
       <w:pPr>
         <w:pStyle w:val="Normal.0"/>
         <w:ind w:left="720" w:firstLine="0"/>
@@ -2450,7 +2531,7 @@
           <w:type w:val="continuous"/>
           <w:pgSz w:w="11900" w:h="16840" w:orient="portrait"/>
           <w:pgMar w:top="1440" w:right="701" w:bottom="1440" w:left="993" w:header="708" w:footer="708"/>
-          <w:cols w:space="708" w:num="2" w:equalWidth="1"/>
+          <w:cols w:equalWidth="1" w:space="708" w:num="2"/>
           <w:bidi w:val="0"/>
         </w:sectPr>
       </w:pPr>
@@ -2460,24 +2541,24 @@
         </w:rPr>
       </w:r>
     </w:p>
-    <w:p>
+    <w:p xmlns:wp14="http://schemas.microsoft.com/office/word/2010/wordml" wp14:textId="77777777">
       <w:pPr>
         <w:pStyle w:val="Normal.0"/>
         <w:ind w:left="720" w:firstLine="0"/>
         <w:jc w:val="both"/>
         <w:rPr>
-          <w:rFonts w:ascii="Arial" w:cs="Arial" w:hAnsi="Arial" w:eastAsia="Arial"/>
-          <w:sz w:val="20"/>
-          <w:szCs w:val="20"/>
-          <w:lang w:val="en-US"/>
-        </w:rPr>
-      </w:pPr>
-    </w:p>
-    <w:p>
-      <w:pPr>
-        <w:pStyle w:val="Normal.0"/>
-        <w:rPr>
-          <w:rFonts w:ascii="Arial" w:cs="Arial" w:hAnsi="Arial" w:eastAsia="Arial"/>
+          <w:rFonts w:ascii="Arial" w:hAnsi="Arial" w:eastAsia="Arial" w:cs="Arial"/>
+          <w:sz w:val="20"/>
+          <w:szCs w:val="20"/>
+          <w:lang w:val="en-US"/>
+        </w:rPr>
+      </w:pPr>
+    </w:p>
+    <w:p xmlns:wp14="http://schemas.microsoft.com/office/word/2010/wordml" wp14:textId="77777777">
+      <w:pPr>
+        <w:pStyle w:val="Normal.0"/>
+        <w:rPr>
+          <w:rFonts w:ascii="Arial" w:hAnsi="Arial" w:eastAsia="Arial" w:cs="Arial"/>
           <w:b w:val="1"/>
           <w:bCs w:val="1"/>
           <w:sz w:val="20"/>
@@ -2499,7 +2580,7 @@
       </w:r>
       <w:r>
         <w:rPr>
-          <w:rFonts w:ascii="Arial" w:hAnsi="Arial" w:hint="default"/>
+          <w:rFonts w:hint="default" w:ascii="Arial" w:hAnsi="Arial"/>
           <w:b w:val="1"/>
           <w:bCs w:val="1"/>
           <w:sz w:val="20"/>
@@ -2522,12 +2603,12 @@
         <w:t>September 2016</w:t>
       </w:r>
     </w:p>
-    <w:p>
+    <w:p xmlns:wp14="http://schemas.microsoft.com/office/word/2010/wordml" wp14:textId="77777777">
       <w:pPr>
         <w:pStyle w:val="Normal.0"/>
         <w:jc w:val="center"/>
         <w:rPr>
-          <w:rFonts w:ascii="Arial" w:cs="Arial" w:hAnsi="Arial" w:eastAsia="Arial"/>
+          <w:rFonts w:ascii="Arial" w:hAnsi="Arial" w:eastAsia="Arial" w:cs="Arial"/>
           <w:b w:val="1"/>
           <w:bCs w:val="1"/>
           <w:sz w:val="20"/>
@@ -2548,12 +2629,12 @@
         <w:t>Company: Ageas Insurance Ltd</w:t>
       </w:r>
     </w:p>
-    <w:p>
+    <w:p xmlns:wp14="http://schemas.microsoft.com/office/word/2010/wordml" wp14:textId="77777777">
       <w:pPr>
         <w:pStyle w:val="Normal.0"/>
         <w:jc w:val="center"/>
         <w:rPr>
-          <w:rFonts w:ascii="Arial" w:cs="Arial" w:hAnsi="Arial" w:eastAsia="Arial"/>
+          <w:rFonts w:ascii="Arial" w:hAnsi="Arial" w:eastAsia="Arial" w:cs="Arial"/>
           <w:b w:val="1"/>
           <w:bCs w:val="1"/>
           <w:sz w:val="20"/>
@@ -2574,11 +2655,11 @@
         <w:t>Role: Motor Claims Technical Advisor</w:t>
       </w:r>
     </w:p>
-    <w:p>
-      <w:pPr>
-        <w:pStyle w:val="Normal.0"/>
-        <w:rPr>
-          <w:rFonts w:ascii="Arial" w:cs="Arial" w:hAnsi="Arial" w:eastAsia="Arial"/>
+    <w:p xmlns:wp14="http://schemas.microsoft.com/office/word/2010/wordml" wp14:textId="77777777">
+      <w:pPr>
+        <w:pStyle w:val="Normal.0"/>
+        <w:rPr>
+          <w:rFonts w:ascii="Arial" w:hAnsi="Arial" w:eastAsia="Arial" w:cs="Arial"/>
           <w:b w:val="1"/>
           <w:bCs w:val="1"/>
           <w:sz w:val="20"/>
@@ -2637,11 +2718,11 @@
         <w:t>:</w:t>
       </w:r>
     </w:p>
-    <w:p>
-      <w:pPr>
-        <w:pStyle w:val="Normal.0"/>
-        <w:rPr>
-          <w:rFonts w:ascii="Arial" w:cs="Arial" w:hAnsi="Arial" w:eastAsia="Arial"/>
+    <w:p xmlns:wp14="http://schemas.microsoft.com/office/word/2010/wordml" wp14:textId="77777777">
+      <w:pPr>
+        <w:pStyle w:val="Normal.0"/>
+        <w:rPr>
+          <w:rFonts w:ascii="Arial" w:hAnsi="Arial" w:eastAsia="Arial" w:cs="Arial"/>
           <w:sz w:val="20"/>
           <w:szCs w:val="20"/>
         </w:rPr>
@@ -2727,23 +2808,23 @@
         <w:t xml:space="preserve"> patterns  and applying this knowledge to future cases. </w:t>
       </w:r>
     </w:p>
-    <w:p>
-      <w:pPr>
-        <w:pStyle w:val="Normal.0"/>
-        <w:rPr>
-          <w:rFonts w:ascii="Arial" w:cs="Arial" w:hAnsi="Arial" w:eastAsia="Arial"/>
-          <w:sz w:val="20"/>
-          <w:szCs w:val="20"/>
-          <w:lang w:val="en-US"/>
-        </w:rPr>
-      </w:pPr>
-    </w:p>
-    <w:p>
+    <w:p xmlns:wp14="http://schemas.microsoft.com/office/word/2010/wordml" wp14:textId="77777777">
+      <w:pPr>
+        <w:pStyle w:val="Normal.0"/>
+        <w:rPr>
+          <w:rFonts w:ascii="Arial" w:hAnsi="Arial" w:eastAsia="Arial" w:cs="Arial"/>
+          <w:sz w:val="20"/>
+          <w:szCs w:val="20"/>
+          <w:lang w:val="en-US"/>
+        </w:rPr>
+      </w:pPr>
+    </w:p>
+    <w:p xmlns:wp14="http://schemas.microsoft.com/office/word/2010/wordml" wp14:textId="77777777">
       <w:pPr>
         <w:pStyle w:val="Normal.0"/>
         <w:jc w:val="both"/>
         <w:rPr>
-          <w:rFonts w:ascii="Arial" w:cs="Arial" w:hAnsi="Arial" w:eastAsia="Arial"/>
+          <w:rFonts w:ascii="Arial" w:hAnsi="Arial" w:eastAsia="Arial" w:cs="Arial"/>
           <w:b w:val="1"/>
           <w:bCs w:val="1"/>
           <w:sz w:val="20"/>
@@ -2764,12 +2845,12 @@
         <w:t>April 2012 - June 2014</w:t>
       </w:r>
     </w:p>
-    <w:p>
+    <w:p xmlns:wp14="http://schemas.microsoft.com/office/word/2010/wordml" wp14:textId="77777777">
       <w:pPr>
         <w:pStyle w:val="Normal.0"/>
         <w:jc w:val="center"/>
         <w:rPr>
-          <w:rFonts w:ascii="Arial" w:cs="Arial" w:hAnsi="Arial" w:eastAsia="Arial"/>
+          <w:rFonts w:ascii="Arial" w:hAnsi="Arial" w:eastAsia="Arial" w:cs="Arial"/>
           <w:b w:val="1"/>
           <w:bCs w:val="1"/>
           <w:sz w:val="20"/>
@@ -2800,12 +2881,12 @@
         <w:t>Company: Ageas Insurance Ltd</w:t>
       </w:r>
     </w:p>
-    <w:p>
+    <w:p xmlns:wp14="http://schemas.microsoft.com/office/word/2010/wordml" wp14:textId="77777777">
       <w:pPr>
         <w:pStyle w:val="Normal.0"/>
         <w:jc w:val="center"/>
         <w:rPr>
-          <w:rFonts w:ascii="Arial" w:cs="Arial" w:hAnsi="Arial" w:eastAsia="Arial"/>
+          <w:rFonts w:ascii="Arial" w:hAnsi="Arial" w:eastAsia="Arial" w:cs="Arial"/>
           <w:b w:val="1"/>
           <w:bCs w:val="1"/>
           <w:sz w:val="20"/>
@@ -2826,11 +2907,11 @@
         <w:t>Role: Customer Service Advisor</w:t>
       </w:r>
     </w:p>
-    <w:p>
-      <w:pPr>
-        <w:pStyle w:val="Normal.0"/>
-        <w:rPr>
-          <w:rFonts w:ascii="Arial" w:cs="Arial" w:hAnsi="Arial" w:eastAsia="Arial"/>
+    <w:p xmlns:wp14="http://schemas.microsoft.com/office/word/2010/wordml" wp14:textId="77777777">
+      <w:pPr>
+        <w:pStyle w:val="Normal.0"/>
+        <w:rPr>
+          <w:rFonts w:ascii="Arial" w:hAnsi="Arial" w:eastAsia="Arial" w:cs="Arial"/>
           <w:b w:val="1"/>
           <w:bCs w:val="1"/>
           <w:sz w:val="20"/>
@@ -2871,12 +2952,12 @@
         <w:t>:</w:t>
       </w:r>
     </w:p>
-    <w:p>
+    <w:p xmlns:wp14="http://schemas.microsoft.com/office/word/2010/wordml" wp14:textId="77777777">
       <w:pPr>
         <w:pStyle w:val="Normal.0"/>
         <w:jc w:val="both"/>
         <w:rPr>
-          <w:rFonts w:ascii="Arial" w:cs="Arial" w:hAnsi="Arial" w:eastAsia="Arial"/>
+          <w:rFonts w:ascii="Arial" w:hAnsi="Arial" w:eastAsia="Arial" w:cs="Arial"/>
           <w:sz w:val="20"/>
           <w:szCs w:val="20"/>
           <w:lang w:val="en-US"/>
@@ -2953,24 +3034,24 @@
         <w:t xml:space="preserve"> a range of training, which included Customer Service in Car Insurance; Coaching, and CII.</w:t>
       </w:r>
     </w:p>
-    <w:p>
+    <w:p xmlns:wp14="http://schemas.microsoft.com/office/word/2010/wordml" wp14:textId="77777777">
       <w:pPr>
         <w:pStyle w:val="Normal.0"/>
         <w:jc w:val="both"/>
         <w:rPr>
-          <w:rFonts w:ascii="Arial" w:cs="Arial" w:hAnsi="Arial" w:eastAsia="Arial"/>
-          <w:sz w:val="20"/>
-          <w:szCs w:val="20"/>
-          <w:lang w:val="en-US"/>
-        </w:rPr>
-      </w:pPr>
-    </w:p>
-    <w:p>
+          <w:rFonts w:ascii="Arial" w:hAnsi="Arial" w:eastAsia="Arial" w:cs="Arial"/>
+          <w:sz w:val="20"/>
+          <w:szCs w:val="20"/>
+          <w:lang w:val="en-US"/>
+        </w:rPr>
+      </w:pPr>
+    </w:p>
+    <w:p xmlns:wp14="http://schemas.microsoft.com/office/word/2010/wordml" wp14:textId="77777777">
       <w:pPr>
         <w:pStyle w:val="Normal.0"/>
         <w:jc w:val="both"/>
         <w:rPr>
-          <w:rFonts w:ascii="Arial" w:cs="Arial" w:hAnsi="Arial" w:eastAsia="Arial"/>
+          <w:rFonts w:ascii="Arial" w:hAnsi="Arial" w:eastAsia="Arial" w:cs="Arial"/>
           <w:b w:val="1"/>
           <w:bCs w:val="1"/>
           <w:sz w:val="20"/>
@@ -2991,12 +3072,12 @@
         <w:t>August 2011 - December 2011</w:t>
       </w:r>
     </w:p>
-    <w:p>
+    <w:p xmlns:wp14="http://schemas.microsoft.com/office/word/2010/wordml" wp14:textId="77777777">
       <w:pPr>
         <w:pStyle w:val="Normal.0"/>
         <w:jc w:val="center"/>
         <w:rPr>
-          <w:rFonts w:ascii="Arial" w:cs="Arial" w:hAnsi="Arial" w:eastAsia="Arial"/>
+          <w:rFonts w:ascii="Arial" w:hAnsi="Arial" w:eastAsia="Arial" w:cs="Arial"/>
           <w:b w:val="1"/>
           <w:bCs w:val="1"/>
           <w:sz w:val="20"/>
@@ -3039,12 +3120,12 @@
         <w:t>Venture Photography</w:t>
       </w:r>
     </w:p>
-    <w:p>
+    <w:p xmlns:wp14="http://schemas.microsoft.com/office/word/2010/wordml" wp14:textId="77777777">
       <w:pPr>
         <w:pStyle w:val="Normal.0"/>
         <w:jc w:val="center"/>
         <w:rPr>
-          <w:rFonts w:ascii="Arial" w:cs="Arial" w:hAnsi="Arial" w:eastAsia="Arial"/>
+          <w:rFonts w:ascii="Arial" w:hAnsi="Arial" w:eastAsia="Arial" w:cs="Arial"/>
           <w:b w:val="1"/>
           <w:bCs w:val="1"/>
           <w:sz w:val="20"/>
@@ -3065,11 +3146,11 @@
         <w:t>Role: Design Consultant</w:t>
       </w:r>
     </w:p>
-    <w:p>
-      <w:pPr>
-        <w:pStyle w:val="Normal.0"/>
-        <w:rPr>
-          <w:rFonts w:ascii="Arial" w:cs="Arial" w:hAnsi="Arial" w:eastAsia="Arial"/>
+    <w:p xmlns:wp14="http://schemas.microsoft.com/office/word/2010/wordml" wp14:textId="77777777">
+      <w:pPr>
+        <w:pStyle w:val="Normal.0"/>
+        <w:rPr>
+          <w:rFonts w:ascii="Arial" w:hAnsi="Arial" w:eastAsia="Arial" w:cs="Arial"/>
           <w:b w:val="1"/>
           <w:bCs w:val="1"/>
           <w:sz w:val="20"/>
@@ -3120,33 +3201,158 @@
         <w:t>:</w:t>
       </w:r>
     </w:p>
-    <w:p>
+    <w:p xmlns:wp14="http://schemas.microsoft.com/office/word/2010/wordml" wp14:textId="152094AD">
       <w:pPr>
         <w:pStyle w:val="Normal.0"/>
         <w:jc w:val="both"/>
         <w:rPr>
-          <w:rFonts w:ascii="Arial" w:cs="Arial" w:hAnsi="Arial" w:eastAsia="Arial"/>
-          <w:sz w:val="20"/>
-          <w:szCs w:val="20"/>
-          <w:lang w:val="en-US"/>
-        </w:rPr>
-      </w:pPr>
-      <w:r>
-        <w:rPr>
-          <w:rFonts w:ascii="Arial" w:hAnsi="Arial"/>
-          <w:sz w:val="20"/>
-          <w:szCs w:val="20"/>
-          <w:rtl w:val="0"/>
-          <w:lang w:val="en-US"/>
-        </w:rPr>
-        <w:t>Venture was all about providing customers with a complete experience.  I was responsible for leading clients through their images and ensuring they had a positive experience whilst they choose their pictures.  My role included sales, digital image manipulation to meet the customers requirements and also ensuring images were ready for collection.  I was also responsible for phoning clients, arranging appointments and covering the Reception desk in the studio.</w:t>
-      </w:r>
-    </w:p>
-    <w:p>
-      <w:pPr>
-        <w:pStyle w:val="Normal.0"/>
-        <w:rPr>
-          <w:rFonts w:ascii="Arial" w:cs="Arial" w:hAnsi="Arial" w:eastAsia="Arial"/>
+          <w:rFonts w:ascii="Arial" w:hAnsi="Arial" w:eastAsia="Arial" w:cs="Arial"/>
+          <w:sz w:val="20"/>
+          <w:szCs w:val="20"/>
+          <w:lang w:val="en-US"/>
+        </w:rPr>
+      </w:pPr>
+      <w:r>
+        <w:rPr>
+          <w:rFonts w:ascii="Arial" w:hAnsi="Arial"/>
+          <w:sz w:val="20"/>
+          <w:szCs w:val="20"/>
+          <w:lang w:val="en-US"/>
+        </w:rPr>
+        <w:t>Venture was all about providing customers with a complete experience</w:t>
+      </w:r>
+      <w:r>
+        <w:rPr>
+          <w:rFonts w:ascii="Arial" w:hAnsi="Arial"/>
+          <w:sz w:val="20"/>
+          <w:szCs w:val="20"/>
+          <w:lang w:val="en-US"/>
+        </w:rPr>
+        <w:t xml:space="preserve">.  </w:t>
+      </w:r>
+      <w:r>
+        <w:rPr>
+          <w:rFonts w:ascii="Arial" w:hAnsi="Arial"/>
+          <w:sz w:val="20"/>
+          <w:szCs w:val="20"/>
+          <w:lang w:val="en-US"/>
+        </w:rPr>
+        <w:t xml:space="preserve">I </w:t>
+      </w:r>
+      <w:r>
+        <w:rPr>
+          <w:rFonts w:ascii="Arial" w:hAnsi="Arial"/>
+          <w:sz w:val="20"/>
+          <w:szCs w:val="20"/>
+          <w:lang w:val="en-US"/>
+        </w:rPr>
+        <w:t>was responsible for</w:t>
+      </w:r>
+      <w:r>
+        <w:rPr>
+          <w:rFonts w:ascii="Arial" w:hAnsi="Arial"/>
+          <w:sz w:val="20"/>
+          <w:szCs w:val="20"/>
+          <w:lang w:val="en-US"/>
+        </w:rPr>
+        <w:t xml:space="preserve"> leading clients through their images and ensuring they had a positive experience whilst they choose their pictures</w:t>
+      </w:r>
+      <w:r>
+        <w:rPr>
+          <w:rFonts w:ascii="Arial" w:hAnsi="Arial"/>
+          <w:sz w:val="20"/>
+          <w:szCs w:val="20"/>
+          <w:lang w:val="en-US"/>
+        </w:rPr>
+        <w:t xml:space="preserve">.  </w:t>
+      </w:r>
+      <w:r>
+        <w:rPr>
+          <w:rFonts w:ascii="Arial" w:hAnsi="Arial"/>
+          <w:sz w:val="20"/>
+          <w:szCs w:val="20"/>
+          <w:lang w:val="en-US"/>
+        </w:rPr>
+        <w:t xml:space="preserve">My role included sales, digital image manipulation to meet the </w:t>
+      </w:r>
+      <w:r>
+        <w:rPr>
+          <w:rFonts w:ascii="Arial" w:hAnsi="Arial"/>
+          <w:sz w:val="20"/>
+          <w:szCs w:val="20"/>
+          <w:lang w:val="en-US"/>
+        </w:rPr>
+        <w:t>customers'</w:t>
+      </w:r>
+      <w:r>
+        <w:rPr>
+          <w:rFonts w:ascii="Arial" w:hAnsi="Arial"/>
+          <w:sz w:val="20"/>
+          <w:szCs w:val="20"/>
+          <w:lang w:val="en-US"/>
+        </w:rPr>
+        <w:t xml:space="preserve"> requirements </w:t>
+      </w:r>
+      <w:r>
+        <w:rPr>
+          <w:rFonts w:ascii="Arial" w:hAnsi="Arial"/>
+          <w:sz w:val="20"/>
+          <w:szCs w:val="20"/>
+          <w:lang w:val="en-US"/>
+        </w:rPr>
+        <w:t>and also</w:t>
+      </w:r>
+      <w:r>
+        <w:rPr>
+          <w:rFonts w:ascii="Arial" w:hAnsi="Arial"/>
+          <w:sz w:val="20"/>
+          <w:szCs w:val="20"/>
+          <w:lang w:val="en-US"/>
+        </w:rPr>
+        <w:t xml:space="preserve"> ensuring images were ready for collection.  I was also responsible for phoning clients, arranging </w:t>
+      </w:r>
+      <w:r>
+        <w:rPr>
+          <w:rFonts w:ascii="Arial" w:hAnsi="Arial"/>
+          <w:sz w:val="20"/>
+          <w:szCs w:val="20"/>
+          <w:lang w:val="en-US"/>
+        </w:rPr>
+        <w:t>appointments</w:t>
+      </w:r>
+      <w:r>
+        <w:rPr>
+          <w:rFonts w:ascii="Arial" w:hAnsi="Arial"/>
+          <w:sz w:val="20"/>
+          <w:szCs w:val="20"/>
+          <w:lang w:val="en-US"/>
+        </w:rPr>
+        <w:t xml:space="preserve"> and covering the </w:t>
+      </w:r>
+      <w:r>
+        <w:rPr>
+          <w:rFonts w:ascii="Arial" w:hAnsi="Arial"/>
+          <w:sz w:val="20"/>
+          <w:szCs w:val="20"/>
+          <w:lang w:val="en-US"/>
+        </w:rPr>
+        <w:t>reception</w:t>
+      </w:r>
+      <w:r>
+        <w:rPr>
+          <w:rFonts w:ascii="Arial" w:hAnsi="Arial"/>
+          <w:sz w:val="20"/>
+          <w:szCs w:val="20"/>
+          <w:lang w:val="en-US"/>
+        </w:rPr>
+        <w:t xml:space="preserve"> desk in the studio.</w:t>
+      </w:r>
+    </w:p>
+    <w:p xmlns:wp14="http://schemas.microsoft.com/office/word/2010/wordml" wp14:textId="77777777">
+      <w:pPr>
+        <w:pStyle w:val="Normal.0"/>
+        <w:rPr>
+          <w:rFonts w:ascii="Arial" w:hAnsi="Arial" w:eastAsia="Arial" w:cs="Arial"/>
           <w:b w:val="1"/>
           <w:bCs w:val="1"/>
           <w:sz w:val="20"/>
@@ -3167,12 +3373,12 @@
         <w:t>___________________________________________________________________________________</w:t>
       </w:r>
     </w:p>
-    <w:p>
+    <w:p xmlns:wp14="http://schemas.microsoft.com/office/word/2010/wordml" wp14:textId="77777777">
       <w:pPr>
         <w:pStyle w:val="Normal.0"/>
         <w:jc w:val="center"/>
         <w:rPr>
-          <w:rFonts w:ascii="Arial" w:cs="Arial" w:hAnsi="Arial" w:eastAsia="Arial"/>
+          <w:rFonts w:ascii="Arial" w:hAnsi="Arial" w:eastAsia="Arial" w:cs="Arial"/>
           <w:b w:val="1"/>
           <w:bCs w:val="1"/>
           <w:outline w:val="0"/>
@@ -3197,8 +3403,6 @@
           <w:color w:val="44546a"/>
           <w:sz w:val="20"/>
           <w:szCs w:val="20"/>
-          <w:u w:color="44546a"/>
-          <w:rtl w:val="0"/>
           <w:lang w:val="en-US"/>
           <w14:textFill>
             <w14:solidFill>
@@ -3213,16 +3417,243 @@
       <w:pPr>
         <w:pStyle w:val="Normal.0"/>
         <w:rPr>
-          <w:rFonts w:ascii="Arial" w:cs="Arial" w:hAnsi="Arial" w:eastAsia="Arial"/>
-          <w:b w:val="1"/>
-          <w:bCs w:val="1"/>
-          <w:sz w:val="20"/>
-          <w:szCs w:val="20"/>
-        </w:rPr>
-      </w:pPr>
-      <w:r>
-        <w:rPr>
-          <w:rFonts w:ascii="Arial" w:hAnsi="Arial"/>
+          <w:rFonts w:ascii="Cambria" w:hAnsi="Cambria" w:eastAsia="Cambria" w:cs="Cambria"/>
+          <w:b w:val="0"/>
+          <w:bCs w:val="0"/>
+          <w:sz w:val="24"/>
+          <w:szCs w:val="24"/>
+        </w:rPr>
+      </w:pPr>
+      <w:hyperlink r:id="Radf61154ce8246e2">
+        <w:r>
+          <w:rPr>
+            <w:rStyle w:val="Hyperlink"/>
+            <w:rFonts w:ascii="Cambria" w:hAnsi="Cambria" w:eastAsia="Cambria" w:cs="Cambria"/>
+            <w:b w:val="0"/>
+            <w:bCs w:val="0"/>
+            <w:i w:val="0"/>
+            <w:iCs w:val="0"/>
+            <w:caps w:val="0"/>
+            <w:smallCaps w:val="0"/>
+            <w:strike w:val="0"/>
+            <w:dstrike w:val="0"/>
+            <w:noProof w:val="0"/>
+            <w:sz w:val="24"/>
+            <w:szCs w:val="24"/>
+            <w:u w:val="single"/>
+            <w:lang w:val="en-US"/>
+          </w:rPr>
+          <w:t>https://afoghandi.github.io/portfolio-2024/</w:t>
+        </w:r>
+      </w:hyperlink>
+    </w:p>
+    <w:p>
+      <w:pPr>
+        <w:pStyle w:val="Normal.0"/>
+        <w:rPr>
+          <w:rFonts w:ascii="Cambria" w:hAnsi="Cambria" w:eastAsia="Cambria" w:cs="Cambria"/>
+          <w:b w:val="0"/>
+          <w:bCs w:val="0"/>
+          <w:sz w:val="24"/>
+          <w:szCs w:val="24"/>
+        </w:rPr>
+      </w:pPr>
+      <w:hyperlink r:id="R91fc46d2fc744c8b">
+        <w:r>
+          <w:rPr>
+            <w:rStyle w:val="Hyperlink"/>
+            <w:rFonts w:ascii="Cambria" w:hAnsi="Cambria" w:eastAsia="Cambria" w:cs="Cambria"/>
+            <w:b w:val="0"/>
+            <w:bCs w:val="0"/>
+            <w:i w:val="0"/>
+            <w:iCs w:val="0"/>
+            <w:caps w:val="0"/>
+            <w:smallCaps w:val="0"/>
+            <w:strike w:val="0"/>
+            <w:dstrike w:val="0"/>
+            <w:noProof w:val="0"/>
+            <w:sz w:val="24"/>
+            <w:szCs w:val="24"/>
+            <w:u w:val="single"/>
+            <w:lang w:val="en-US"/>
+          </w:rPr>
+          <w:t>https://afoghandi.github.io/cowch/</w:t>
+        </w:r>
+      </w:hyperlink>
+    </w:p>
+    <w:p>
+      <w:pPr>
+        <w:pStyle w:val="Normal.0"/>
+        <w:rPr>
+          <w:noProof w:val="0"/>
+          <w:lang w:val="en-US"/>
+        </w:rPr>
+      </w:pPr>
+      <w:hyperlink r:id="Ra799a2f4e9f147e5">
+        <w:r>
+          <w:rPr>
+            <w:rStyle w:val="Hyperlink"/>
+            <w:noProof w:val="0"/>
+            <w:lang w:val="en-US"/>
+          </w:rPr>
+          <w:t>https://weatherapp-emfo.onrender.com/Weather</w:t>
+        </w:r>
+      </w:hyperlink>
+    </w:p>
+    <w:p>
+      <w:pPr>
+        <w:pStyle w:val="Normal.0"/>
+        <w:rPr>
+          <w:rFonts w:ascii="Cambria" w:hAnsi="Cambria" w:eastAsia="Cambria" w:cs="Cambria"/>
+          <w:b w:val="0"/>
+          <w:bCs w:val="0"/>
+          <w:noProof w:val="0"/>
+          <w:sz w:val="24"/>
+          <w:szCs w:val="24"/>
+          <w:lang w:val="en-US"/>
+        </w:rPr>
+      </w:pPr>
+      <w:hyperlink r:id="Rcd0db66a3b8f4531">
+        <w:r>
+          <w:rPr>
+            <w:rStyle w:val="Hyperlink"/>
+            <w:rFonts w:ascii="Cambria" w:hAnsi="Cambria" w:eastAsia="Cambria" w:cs="Cambria"/>
+            <w:b w:val="0"/>
+            <w:bCs w:val="0"/>
+            <w:noProof w:val="0"/>
+            <w:sz w:val="24"/>
+            <w:szCs w:val="24"/>
+            <w:lang w:val="en-US"/>
+          </w:rPr>
+          <w:t>https://royal-tosh.vercel.app/</w:t>
+        </w:r>
+      </w:hyperlink>
+    </w:p>
+    <w:p>
+      <w:pPr>
+        <w:pStyle w:val="Normal.0"/>
+        <w:rPr>
+          <w:rFonts w:ascii="Cambria" w:hAnsi="Cambria" w:eastAsia="Cambria" w:cs="Cambria"/>
+          <w:b w:val="0"/>
+          <w:bCs w:val="0"/>
+          <w:noProof w:val="0"/>
+          <w:sz w:val="24"/>
+          <w:szCs w:val="24"/>
+          <w:lang w:val="en-US"/>
+        </w:rPr>
+      </w:pPr>
+      <w:hyperlink r:id="R0667c0db482d49b1">
+        <w:r>
+          <w:rPr>
+            <w:rStyle w:val="Hyperlink"/>
+            <w:rFonts w:ascii="Cambria" w:hAnsi="Cambria" w:eastAsia="Cambria" w:cs="Cambria"/>
+            <w:b w:val="0"/>
+            <w:bCs w:val="0"/>
+            <w:noProof w:val="0"/>
+            <w:sz w:val="24"/>
+            <w:szCs w:val="24"/>
+            <w:lang w:val="en-US"/>
+          </w:rPr>
+          <w:t>https://modern-bank-rosy.vercel.app/</w:t>
+        </w:r>
+      </w:hyperlink>
+    </w:p>
+    <w:p>
+      <w:pPr>
+        <w:pStyle w:val="Normal.0"/>
+        <w:rPr>
+          <w:rFonts w:ascii="Cambria" w:hAnsi="Cambria" w:eastAsia="Cambria" w:cs="Cambria"/>
+          <w:b w:val="0"/>
+          <w:bCs w:val="0"/>
+          <w:noProof w:val="0"/>
+          <w:sz w:val="24"/>
+          <w:szCs w:val="24"/>
+          <w:lang w:val="en-US"/>
+        </w:rPr>
+      </w:pPr>
+      <w:hyperlink r:id="R4a5f69a2e33e4d53">
+        <w:r>
+          <w:rPr>
+            <w:rStyle w:val="Hyperlink"/>
+            <w:rFonts w:ascii="Cambria" w:hAnsi="Cambria" w:eastAsia="Cambria" w:cs="Cambria"/>
+            <w:b w:val="0"/>
+            <w:bCs w:val="0"/>
+            <w:i w:val="0"/>
+            <w:iCs w:val="0"/>
+            <w:caps w:val="0"/>
+            <w:smallCaps w:val="0"/>
+            <w:strike w:val="0"/>
+            <w:dstrike w:val="0"/>
+            <w:noProof w:val="0"/>
+            <w:sz w:val="24"/>
+            <w:szCs w:val="24"/>
+            <w:u w:val="single"/>
+            <w:lang w:val="en-US"/>
+          </w:rPr>
+          <w:t>https://afoghandi.github.io/gerich/</w:t>
+        </w:r>
+      </w:hyperlink>
+    </w:p>
+    <w:p xmlns:wp14="http://schemas.microsoft.com/office/word/2010/wordml" wp14:textId="77777777">
+      <w:pPr>
+        <w:pStyle w:val="Normal.0"/>
+        <w:rPr>
+          <w:rFonts w:ascii="Arial" w:hAnsi="Arial" w:eastAsia="Arial" w:cs="Arial"/>
+          <w:sz w:val="20"/>
+          <w:szCs w:val="20"/>
+        </w:rPr>
+      </w:pPr>
+    </w:p>
+    <w:p xmlns:wp14="http://schemas.microsoft.com/office/word/2010/wordml" wp14:textId="77777777">
+      <w:pPr>
+        <w:pStyle w:val="Normal.0"/>
+        <w:rPr>
+          <w:rFonts w:ascii="Arial" w:hAnsi="Arial" w:eastAsia="Arial" w:cs="Arial"/>
+          <w:sz w:val="20"/>
+          <w:szCs w:val="20"/>
+        </w:rPr>
+      </w:pPr>
+    </w:p>
+    <w:p xmlns:wp14="http://schemas.microsoft.com/office/word/2010/wordml" wp14:textId="77777777">
+      <w:pPr>
+        <w:pStyle w:val="Normal.0"/>
+        <w:rPr>
+          <w:rFonts w:ascii="Arial" w:hAnsi="Arial" w:eastAsia="Arial" w:cs="Arial"/>
+          <w:sz w:val="20"/>
+          <w:szCs w:val="20"/>
+        </w:rPr>
+        <w:sectPr>
+          <w:type w:val="continuous"/>
+          <w:pgSz w:w="11900" w:h="16840" w:orient="portrait"/>
+          <w:pgMar w:top="1440" w:right="701" w:bottom="1440" w:left="993" w:header="708" w:footer="708"/>
+          <w:bidi w:val="0"/>
+          <w:cols w:num="1"/>
+        </w:sectPr>
+      </w:pPr>
+      <w:r>
+        <w:rPr>
+          <w:rFonts w:ascii="Arial" w:hAnsi="Arial" w:eastAsia="Arial" w:cs="Arial"/>
+          <w:sz w:val="20"/>
+          <w:szCs w:val="20"/>
+        </w:rPr>
+      </w:r>
+    </w:p>
+    <w:p xmlns:wp14="http://schemas.microsoft.com/office/word/2010/wordml" wp14:textId="77777777">
+      <w:pPr>
+        <w:pStyle w:val="Normal.0"/>
+        <w:rPr>
+          <w:rFonts w:ascii="Arial" w:hAnsi="Arial" w:eastAsia="Arial" w:cs="Arial"/>
+          <w:sz w:val="20"/>
+          <w:szCs w:val="20"/>
+        </w:rPr>
+      </w:pPr>
+    </w:p>
+    <w:p xmlns:wp14="http://schemas.microsoft.com/office/word/2010/wordml" wp14:textId="77777777">
+      <w:pPr>
+        <w:pStyle w:val="Normal.0"/>
+        <w:jc w:val="center"/>
+        <w:rPr>
+          <w:rFonts w:ascii="Arial" w:hAnsi="Arial" w:eastAsia="Arial" w:cs="Arial"/>
           <w:b w:val="1"/>
           <w:bCs w:val="1"/>
           <w:outline w:val="0"/>
@@ -3230,7 +3661,6 @@
           <w:sz w:val="20"/>
           <w:szCs w:val="20"/>
           <w:u w:color="44546a"/>
-          <w:rtl w:val="0"/>
           <w:lang w:val="en-US"/>
           <w14:textFill>
             <w14:solidFill>
@@ -3238,260 +3668,10 @@
             </w14:solidFill>
           </w14:textFill>
         </w:rPr>
-        <w:t>Static</w:t>
-      </w:r>
-      <w:r>
-        <w:rPr>
-          <w:rFonts w:ascii="Arial" w:hAnsi="Arial"/>
-          <w:b w:val="1"/>
-          <w:bCs w:val="1"/>
-          <w:sz w:val="20"/>
-          <w:szCs w:val="20"/>
-          <w:rtl w:val="0"/>
-          <w:lang w:val="en-US"/>
-        </w:rPr>
-        <w:t xml:space="preserve"> Website:</w:t>
-      </w:r>
-    </w:p>
-    <w:p>
-      <w:pPr>
-        <w:pStyle w:val="Normal.0"/>
-        <w:numPr>
-          <w:ilvl w:val="0"/>
-          <w:numId w:val="5"/>
-        </w:numPr>
-        <w:rPr>
-          <w:sz w:val="20"/>
-          <w:szCs w:val="20"/>
-        </w:rPr>
-      </w:pPr>
-      <w:r>
-        <w:rPr>
-          <w:rFonts w:ascii="Arial" w:hAnsi="Arial"/>
-          <w:sz w:val="20"/>
-          <w:szCs w:val="20"/>
-          <w:rtl w:val="0"/>
-          <w:lang w:val="en-US"/>
-        </w:rPr>
-        <w:t xml:space="preserve"> </w:t>
-      </w:r>
-      <w:r>
-        <w:rPr>
-          <w:rStyle w:val="Link"/>
-        </w:rPr>
-        <w:fldChar w:fldCharType="begin" w:fldLock="0"/>
-      </w:r>
-      <w:r>
-        <w:rPr>
-          <w:rStyle w:val="Link"/>
-        </w:rPr>
-        <w:instrText xml:space="preserve"> HYPERLINK "https://royal-tosh.vercel.app/"</w:instrText>
-      </w:r>
-      <w:r>
-        <w:rPr>
-          <w:rStyle w:val="Link"/>
-        </w:rPr>
-        <w:fldChar w:fldCharType="separate" w:fldLock="0"/>
-      </w:r>
-      <w:r>
-        <w:rPr>
-          <w:rStyle w:val="Link"/>
-          <w:rtl w:val="0"/>
-        </w:rPr>
-        <w:t>https://royal-tosh.vercel.app/</w:t>
-      </w:r>
-      <w:r>
-        <w:rPr/>
-        <w:fldChar w:fldCharType="end" w:fldLock="0"/>
-      </w:r>
-    </w:p>
-    <w:p>
-      <w:pPr>
-        <w:pStyle w:val="Normal.0"/>
-        <w:numPr>
-          <w:ilvl w:val="0"/>
-          <w:numId w:val="5"/>
-        </w:numPr>
-        <w:rPr>
-          <w:sz w:val="20"/>
-          <w:szCs w:val="20"/>
-        </w:rPr>
-      </w:pPr>
-      <w:r>
-        <w:rPr>
-          <w:rFonts w:ascii="Arial" w:hAnsi="Arial"/>
-          <w:sz w:val="20"/>
-          <w:szCs w:val="20"/>
-          <w:rtl w:val="0"/>
-          <w:lang w:val="en-US"/>
-        </w:rPr>
-        <w:t xml:space="preserve"> </w:t>
-      </w:r>
-      <w:r>
-        <w:rPr>
-          <w:rStyle w:val="Link"/>
-        </w:rPr>
-        <w:fldChar w:fldCharType="begin" w:fldLock="0"/>
-      </w:r>
-      <w:r>
-        <w:rPr>
-          <w:rStyle w:val="Link"/>
-        </w:rPr>
-        <w:instrText xml:space="preserve"> HYPERLINK "https://royal-tosh.vercel.app/"</w:instrText>
-      </w:r>
-      <w:r>
-        <w:rPr>
-          <w:rStyle w:val="Link"/>
-        </w:rPr>
-        <w:fldChar w:fldCharType="separate" w:fldLock="0"/>
-      </w:r>
-      <w:r>
-        <w:rPr>
-          <w:rStyle w:val="Link"/>
-          <w:rtl w:val="0"/>
-        </w:rPr>
-        <w:t>https://royal-tosh.vercel.app/</w:t>
-      </w:r>
-      <w:r>
-        <w:rPr/>
-        <w:fldChar w:fldCharType="end" w:fldLock="0"/>
-      </w:r>
-    </w:p>
-    <w:p>
-      <w:pPr>
-        <w:pStyle w:val="Normal.0"/>
-        <w:numPr>
-          <w:ilvl w:val="0"/>
-          <w:numId w:val="6"/>
-        </w:numPr>
-      </w:pPr>
-      <w:r>
-        <w:rPr>
-          <w:rStyle w:val="Link"/>
-        </w:rPr>
-        <w:fldChar w:fldCharType="begin" w:fldLock="0"/>
-      </w:r>
-      <w:r>
-        <w:rPr>
-          <w:rStyle w:val="Link"/>
-        </w:rPr>
-        <w:instrText xml:space="preserve"> HYPERLINK "https://afoghandi.github.io/gerich/"</w:instrText>
-      </w:r>
-      <w:r>
-        <w:rPr>
-          <w:rStyle w:val="Link"/>
-        </w:rPr>
-        <w:fldChar w:fldCharType="separate" w:fldLock="0"/>
-      </w:r>
-      <w:r>
-        <w:rPr>
-          <w:rStyle w:val="Link"/>
-          <w:rtl w:val="0"/>
-        </w:rPr>
-        <w:t>https://afoghandi.github.io/gerich/</w:t>
-      </w:r>
-      <w:r>
-        <w:rPr/>
-        <w:fldChar w:fldCharType="end" w:fldLock="0"/>
-      </w:r>
-    </w:p>
-    <w:p>
-      <w:pPr>
-        <w:pStyle w:val="Normal.0"/>
-        <w:numPr>
-          <w:ilvl w:val="0"/>
-          <w:numId w:val="6"/>
-        </w:numPr>
-      </w:pPr>
-      <w:r>
-        <w:rPr>
-          <w:rStyle w:val="Link"/>
-        </w:rPr>
-        <w:fldChar w:fldCharType="begin" w:fldLock="0"/>
-      </w:r>
-      <w:r>
-        <w:rPr>
-          <w:rStyle w:val="Link"/>
-        </w:rPr>
-        <w:instrText xml:space="preserve"> HYPERLINK "https://modern-bank-rosy.vercel.app/"</w:instrText>
-      </w:r>
-      <w:r>
-        <w:rPr>
-          <w:rStyle w:val="Link"/>
-        </w:rPr>
-        <w:fldChar w:fldCharType="separate" w:fldLock="0"/>
-      </w:r>
-      <w:r>
-        <w:rPr>
-          <w:rStyle w:val="Link"/>
-          <w:rtl w:val="0"/>
-        </w:rPr>
-        <w:t>https://modern-bank-rosy.vercel.app/</w:t>
-      </w:r>
-      <w:r>
-        <w:rPr/>
-        <w:fldChar w:fldCharType="end" w:fldLock="0"/>
-      </w:r>
-    </w:p>
-    <w:p>
-      <w:pPr>
-        <w:pStyle w:val="Normal.0"/>
-        <w:rPr>
-          <w:rFonts w:ascii="Arial" w:cs="Arial" w:hAnsi="Arial" w:eastAsia="Arial"/>
-          <w:sz w:val="20"/>
-          <w:szCs w:val="20"/>
-        </w:rPr>
-      </w:pPr>
-    </w:p>
-    <w:p>
-      <w:pPr>
-        <w:pStyle w:val="Normal.0"/>
-        <w:rPr>
-          <w:rFonts w:ascii="Arial" w:cs="Arial" w:hAnsi="Arial" w:eastAsia="Arial"/>
-          <w:sz w:val="20"/>
-          <w:szCs w:val="20"/>
-        </w:rPr>
-      </w:pPr>
-    </w:p>
-    <w:p>
-      <w:pPr>
-        <w:pStyle w:val="Normal.0"/>
-        <w:rPr>
-          <w:rFonts w:ascii="Arial" w:cs="Arial" w:hAnsi="Arial" w:eastAsia="Arial"/>
-          <w:sz w:val="20"/>
-          <w:szCs w:val="20"/>
-        </w:rPr>
-        <w:sectPr>
-          <w:type w:val="continuous"/>
-          <w:pgSz w:w="11900" w:h="16840" w:orient="portrait"/>
-          <w:pgMar w:top="1440" w:right="701" w:bottom="1440" w:left="993" w:header="708" w:footer="708"/>
-          <w:bidi w:val="0"/>
-        </w:sectPr>
-      </w:pPr>
-      <w:r>
-        <w:rPr>
-          <w:rFonts w:ascii="Arial" w:cs="Arial" w:hAnsi="Arial" w:eastAsia="Arial"/>
-          <w:sz w:val="20"/>
-          <w:szCs w:val="20"/>
-        </w:rPr>
-      </w:r>
-    </w:p>
-    <w:p>
-      <w:pPr>
-        <w:pStyle w:val="Normal.0"/>
-        <w:rPr>
-          <w:rFonts w:ascii="Arial" w:cs="Arial" w:hAnsi="Arial" w:eastAsia="Arial"/>
-          <w:sz w:val="20"/>
-          <w:szCs w:val="20"/>
-        </w:rPr>
-      </w:pPr>
-    </w:p>
-    <w:p>
-      <w:pPr>
-        <w:pStyle w:val="Normal.0"/>
-        <w:jc w:val="center"/>
-        <w:rPr>
-          <w:rFonts w:ascii="Arial" w:cs="Arial" w:hAnsi="Arial" w:eastAsia="Arial"/>
+      </w:pPr>
+      <w:r>
+        <w:rPr>
+          <w:rFonts w:ascii="Arial" w:hAnsi="Arial"/>
           <w:b w:val="1"/>
           <w:bCs w:val="1"/>
           <w:outline w:val="0"/>
@@ -3499,6 +3679,7 @@
           <w:sz w:val="20"/>
           <w:szCs w:val="20"/>
           <w:u w:color="44546a"/>
+          <w:rtl w:val="0"/>
           <w:lang w:val="en-US"/>
           <w14:textFill>
             <w14:solidFill>
@@ -3506,29 +3687,10 @@
             </w14:solidFill>
           </w14:textFill>
         </w:rPr>
-      </w:pPr>
-      <w:r>
-        <w:rPr>
-          <w:rFonts w:ascii="Arial" w:hAnsi="Arial"/>
-          <w:b w:val="1"/>
-          <w:bCs w:val="1"/>
-          <w:outline w:val="0"/>
-          <w:color w:val="44546a"/>
-          <w:sz w:val="20"/>
-          <w:szCs w:val="20"/>
-          <w:u w:color="44546a"/>
-          <w:rtl w:val="0"/>
-          <w:lang w:val="en-US"/>
-          <w14:textFill>
-            <w14:solidFill>
-              <w14:srgbClr w14:val="44546A"/>
-            </w14:solidFill>
-          </w14:textFill>
-        </w:rPr>
         <w:t xml:space="preserve"> Professional Qualification</w:t>
       </w:r>
     </w:p>
-    <w:p>
+    <w:p xmlns:wp14="http://schemas.microsoft.com/office/word/2010/wordml" wp14:textId="77777777">
       <w:pPr>
         <w:pStyle w:val="Colorful List - Accent 1"/>
         <w:numPr>
@@ -3557,7 +3719,7 @@
         <w:t>CII Cert</w:t>
       </w:r>
     </w:p>
-    <w:p>
+    <w:p xmlns:wp14="http://schemas.microsoft.com/office/word/2010/wordml" wp14:textId="77777777">
       <w:pPr>
         <w:pStyle w:val="Colorful List - Accent 1"/>
         <w:numPr>
@@ -3592,26 +3754,26 @@
         <w:t>TAP qualified (Dip)</w:t>
       </w:r>
     </w:p>
-    <w:p>
+    <w:p xmlns:wp14="http://schemas.microsoft.com/office/word/2010/wordml" wp14:textId="77777777">
       <w:pPr>
         <w:pStyle w:val="Colorful List - Accent 1"/>
         <w:jc w:val="center"/>
         <w:rPr>
-          <w:rFonts w:ascii="Arial" w:cs="Arial" w:hAnsi="Arial" w:eastAsia="Arial"/>
-          <w:b w:val="1"/>
-          <w:bCs w:val="1"/>
-          <w:sz w:val="20"/>
-          <w:szCs w:val="20"/>
-          <w:lang w:val="en-US"/>
-        </w:rPr>
-      </w:pPr>
-    </w:p>
-    <w:p>
+          <w:rFonts w:ascii="Arial" w:hAnsi="Arial" w:eastAsia="Arial" w:cs="Arial"/>
+          <w:b w:val="1"/>
+          <w:bCs w:val="1"/>
+          <w:sz w:val="20"/>
+          <w:szCs w:val="20"/>
+          <w:lang w:val="en-US"/>
+        </w:rPr>
+      </w:pPr>
+    </w:p>
+    <w:p xmlns:wp14="http://schemas.microsoft.com/office/word/2010/wordml" wp14:textId="77777777">
       <w:pPr>
         <w:pStyle w:val="Colorful List - Accent 1"/>
         <w:jc w:val="center"/>
         <w:rPr>
-          <w:rFonts w:ascii="Arial" w:cs="Arial" w:hAnsi="Arial" w:eastAsia="Arial"/>
+          <w:rFonts w:ascii="Arial" w:hAnsi="Arial" w:eastAsia="Arial" w:cs="Arial"/>
           <w:b w:val="1"/>
           <w:bCs w:val="1"/>
           <w:outline w:val="0"/>
@@ -3648,11 +3810,11 @@
         <w:t>EDUCATION</w:t>
       </w:r>
     </w:p>
-    <w:p>
+    <w:p xmlns:wp14="http://schemas.microsoft.com/office/word/2010/wordml" wp14:textId="77777777">
       <w:pPr>
         <w:pStyle w:val="Colorful List - Accent 1"/>
         <w:rPr>
-          <w:rFonts w:ascii="Arial" w:cs="Arial" w:hAnsi="Arial" w:eastAsia="Arial"/>
+          <w:rFonts w:ascii="Arial" w:hAnsi="Arial" w:eastAsia="Arial" w:cs="Arial"/>
           <w:sz w:val="20"/>
           <w:szCs w:val="20"/>
           <w:lang w:val="en-US"/>
@@ -3669,11 +3831,11 @@
         <w:t>Ilupeju College</w:t>
       </w:r>
     </w:p>
-    <w:p>
+    <w:p xmlns:wp14="http://schemas.microsoft.com/office/word/2010/wordml" wp14:textId="77777777">
       <w:pPr>
         <w:pStyle w:val="Colorful List - Accent 1"/>
         <w:rPr>
-          <w:rFonts w:ascii="Arial" w:cs="Arial" w:hAnsi="Arial" w:eastAsia="Arial"/>
+          <w:rFonts w:ascii="Arial" w:hAnsi="Arial" w:eastAsia="Arial" w:cs="Arial"/>
           <w:sz w:val="20"/>
           <w:szCs w:val="20"/>
           <w:lang w:val="en-US"/>
@@ -3690,11 +3852,11 @@
         <w:t>Nigeria</w:t>
       </w:r>
     </w:p>
-    <w:p>
+    <w:p xmlns:wp14="http://schemas.microsoft.com/office/word/2010/wordml" wp14:textId="77777777">
       <w:pPr>
         <w:pStyle w:val="Colorful List - Accent 1"/>
         <w:rPr>
-          <w:rFonts w:ascii="Arial" w:cs="Arial" w:hAnsi="Arial" w:eastAsia="Arial"/>
+          <w:rFonts w:ascii="Arial" w:hAnsi="Arial" w:eastAsia="Arial" w:cs="Arial"/>
           <w:sz w:val="20"/>
           <w:szCs w:val="20"/>
           <w:lang w:val="en-US"/>
@@ -3711,33 +3873,33 @@
         <w:t>8 GCE (Pass and Credit) incl. English and Mathematics           1998-1999</w:t>
       </w:r>
     </w:p>
-    <w:p>
+    <w:p xmlns:wp14="http://schemas.microsoft.com/office/word/2010/wordml" wp14:textId="77777777">
       <w:pPr>
         <w:pStyle w:val="Colorful List - Accent 1"/>
         <w:rPr>
-          <w:rFonts w:ascii="Arial" w:cs="Arial" w:hAnsi="Arial" w:eastAsia="Arial"/>
-          <w:sz w:val="20"/>
-          <w:szCs w:val="20"/>
-          <w:lang w:val="en-US"/>
-        </w:rPr>
-      </w:pPr>
-    </w:p>
-    <w:p>
+          <w:rFonts w:ascii="Arial" w:hAnsi="Arial" w:eastAsia="Arial" w:cs="Arial"/>
+          <w:sz w:val="20"/>
+          <w:szCs w:val="20"/>
+          <w:lang w:val="en-US"/>
+        </w:rPr>
+      </w:pPr>
+    </w:p>
+    <w:p xmlns:wp14="http://schemas.microsoft.com/office/word/2010/wordml" wp14:textId="77777777">
       <w:pPr>
         <w:pStyle w:val="Colorful List - Accent 1"/>
         <w:rPr>
-          <w:rFonts w:ascii="Arial" w:cs="Arial" w:hAnsi="Arial" w:eastAsia="Arial"/>
-          <w:sz w:val="20"/>
-          <w:szCs w:val="20"/>
-          <w:lang w:val="en-US"/>
-        </w:rPr>
-      </w:pPr>
-    </w:p>
-    <w:p>
+          <w:rFonts w:ascii="Arial" w:hAnsi="Arial" w:eastAsia="Arial" w:cs="Arial"/>
+          <w:sz w:val="20"/>
+          <w:szCs w:val="20"/>
+          <w:lang w:val="en-US"/>
+        </w:rPr>
+      </w:pPr>
+    </w:p>
+    <w:p xmlns:wp14="http://schemas.microsoft.com/office/word/2010/wordml" wp14:textId="77777777">
       <w:pPr>
         <w:pStyle w:val="Colorful List - Accent 1"/>
         <w:rPr>
-          <w:rFonts w:ascii="Arial" w:cs="Arial" w:hAnsi="Arial" w:eastAsia="Arial"/>
+          <w:rFonts w:ascii="Arial" w:hAnsi="Arial" w:eastAsia="Arial" w:cs="Arial"/>
           <w:sz w:val="20"/>
           <w:szCs w:val="20"/>
           <w:lang w:val="en-US"/>
@@ -3754,11 +3916,11 @@
         <w:t>Olabisi Onabanjo University</w:t>
       </w:r>
     </w:p>
-    <w:p>
+    <w:p xmlns:wp14="http://schemas.microsoft.com/office/word/2010/wordml" wp14:textId="77777777">
       <w:pPr>
         <w:pStyle w:val="Colorful List - Accent 1"/>
         <w:rPr>
-          <w:rFonts w:ascii="Arial" w:cs="Arial" w:hAnsi="Arial" w:eastAsia="Arial"/>
+          <w:rFonts w:ascii="Arial" w:hAnsi="Arial" w:eastAsia="Arial" w:cs="Arial"/>
           <w:sz w:val="20"/>
           <w:szCs w:val="20"/>
           <w:lang w:val="en-US"/>
@@ -3775,11 +3937,11 @@
         <w:t>Nigeria</w:t>
       </w:r>
     </w:p>
-    <w:p>
+    <w:p xmlns:wp14="http://schemas.microsoft.com/office/word/2010/wordml" wp14:textId="77777777">
       <w:pPr>
         <w:pStyle w:val="Colorful List - Accent 1"/>
         <w:rPr>
-          <w:rFonts w:ascii="Arial" w:cs="Arial" w:hAnsi="Arial" w:eastAsia="Arial"/>
+          <w:rFonts w:ascii="Arial" w:hAnsi="Arial" w:eastAsia="Arial" w:cs="Arial"/>
           <w:sz w:val="20"/>
           <w:szCs w:val="20"/>
           <w:lang w:val="en-US"/>
@@ -3796,11 +3958,11 @@
         <w:t>Diploma in Industrial and labour Relations (Merit)</w:t>
       </w:r>
     </w:p>
-    <w:p>
+    <w:p xmlns:wp14="http://schemas.microsoft.com/office/word/2010/wordml" wp14:textId="77777777">
       <w:pPr>
         <w:pStyle w:val="Colorful List - Accent 1"/>
         <w:rPr>
-          <w:rFonts w:ascii="Arial" w:cs="Arial" w:hAnsi="Arial" w:eastAsia="Arial"/>
+          <w:rFonts w:ascii="Arial" w:hAnsi="Arial" w:eastAsia="Arial" w:cs="Arial"/>
           <w:sz w:val="20"/>
           <w:szCs w:val="20"/>
           <w:lang w:val="en-US"/>
@@ -3817,22 +3979,22 @@
         <w:t>Modules studied included: Personnel Management, Labour Law, Research Methodology and Statistics                                                                                      1999-2002</w:t>
       </w:r>
     </w:p>
-    <w:p>
+    <w:p xmlns:wp14="http://schemas.microsoft.com/office/word/2010/wordml" wp14:textId="77777777">
       <w:pPr>
         <w:pStyle w:val="Colorful List - Accent 1"/>
         <w:rPr>
-          <w:rFonts w:ascii="Arial" w:cs="Arial" w:hAnsi="Arial" w:eastAsia="Arial"/>
-          <w:sz w:val="20"/>
-          <w:szCs w:val="20"/>
-          <w:lang w:val="en-US"/>
-        </w:rPr>
-      </w:pPr>
-    </w:p>
-    <w:p>
+          <w:rFonts w:ascii="Arial" w:hAnsi="Arial" w:eastAsia="Arial" w:cs="Arial"/>
+          <w:sz w:val="20"/>
+          <w:szCs w:val="20"/>
+          <w:lang w:val="en-US"/>
+        </w:rPr>
+      </w:pPr>
+    </w:p>
+    <w:p xmlns:wp14="http://schemas.microsoft.com/office/word/2010/wordml" wp14:textId="77777777">
       <w:pPr>
         <w:pStyle w:val="Colorful List - Accent 1"/>
         <w:rPr>
-          <w:rFonts w:ascii="Arial" w:cs="Arial" w:hAnsi="Arial" w:eastAsia="Arial"/>
+          <w:rFonts w:ascii="Arial" w:hAnsi="Arial" w:eastAsia="Arial" w:cs="Arial"/>
           <w:sz w:val="20"/>
           <w:szCs w:val="20"/>
           <w:lang w:val="en-US"/>
@@ -3849,11 +4011,11 @@
         <w:t>Yaba College of Technology</w:t>
       </w:r>
     </w:p>
-    <w:p>
+    <w:p xmlns:wp14="http://schemas.microsoft.com/office/word/2010/wordml" wp14:textId="77777777">
       <w:pPr>
         <w:pStyle w:val="Colorful List - Accent 1"/>
         <w:rPr>
-          <w:rFonts w:ascii="Arial" w:cs="Arial" w:hAnsi="Arial" w:eastAsia="Arial"/>
+          <w:rFonts w:ascii="Arial" w:hAnsi="Arial" w:eastAsia="Arial" w:cs="Arial"/>
           <w:sz w:val="20"/>
           <w:szCs w:val="20"/>
           <w:lang w:val="en-US"/>
@@ -3870,11 +4032,11 @@
         <w:t>Nigeria</w:t>
       </w:r>
     </w:p>
-    <w:p>
+    <w:p xmlns:wp14="http://schemas.microsoft.com/office/word/2010/wordml" wp14:textId="77777777">
       <w:pPr>
         <w:pStyle w:val="Colorful List - Accent 1"/>
         <w:rPr>
-          <w:rFonts w:ascii="Arial" w:cs="Arial" w:hAnsi="Arial" w:eastAsia="Arial"/>
+          <w:rFonts w:ascii="Arial" w:hAnsi="Arial" w:eastAsia="Arial" w:cs="Arial"/>
           <w:sz w:val="20"/>
           <w:szCs w:val="20"/>
           <w:lang w:val="en-US"/>
@@ -3891,43 +4053,60 @@
         <w:t>Business Administration</w:t>
       </w:r>
     </w:p>
-    <w:p>
+    <w:p xmlns:wp14="http://schemas.microsoft.com/office/word/2010/wordml" wp14:textId="29821AA2">
       <w:pPr>
         <w:pStyle w:val="Colorful List - Accent 1"/>
         <w:rPr>
-          <w:rFonts w:ascii="Arial" w:cs="Arial" w:hAnsi="Arial" w:eastAsia="Arial"/>
-          <w:sz w:val="20"/>
-          <w:szCs w:val="20"/>
-          <w:lang w:val="en-US"/>
-        </w:rPr>
-      </w:pPr>
-      <w:r>
-        <w:rPr>
-          <w:rFonts w:ascii="Arial" w:hAnsi="Arial"/>
-          <w:sz w:val="20"/>
-          <w:szCs w:val="20"/>
-          <w:rtl w:val="0"/>
-          <w:lang w:val="en-US"/>
-        </w:rPr>
-        <w:t>Diploma (Upper Credit)                                                                2002-2003</w:t>
-      </w:r>
-    </w:p>
-    <w:p>
+          <w:rFonts w:ascii="Arial" w:hAnsi="Arial" w:eastAsia="Arial" w:cs="Arial"/>
+          <w:sz w:val="20"/>
+          <w:szCs w:val="20"/>
+          <w:lang w:val="en-US"/>
+        </w:rPr>
+      </w:pPr>
+      <w:r>
+        <w:rPr>
+          <w:rFonts w:ascii="Arial" w:hAnsi="Arial"/>
+          <w:sz w:val="20"/>
+          <w:szCs w:val="20"/>
+          <w:lang w:val="en-US"/>
+        </w:rPr>
+        <w:t xml:space="preserve">Diploma (Upper </w:t>
+      </w:r>
+      <w:r>
+        <w:rPr>
+          <w:rFonts w:ascii="Arial" w:hAnsi="Arial"/>
+          <w:sz w:val="20"/>
+          <w:szCs w:val="20"/>
+          <w:lang w:val="en-US"/>
+        </w:rPr>
+        <w:t xml:space="preserve">Credit)  </w:t>
+      </w:r>
+      <w:r>
+        <w:rPr>
+          <w:rFonts w:ascii="Arial" w:hAnsi="Arial"/>
+          <w:sz w:val="20"/>
+          <w:szCs w:val="20"/>
+          <w:lang w:val="en-US"/>
+        </w:rPr>
+        <w:t xml:space="preserve">                                                            2002-2003</w:t>
+      </w:r>
+    </w:p>
+    <w:p xmlns:wp14="http://schemas.microsoft.com/office/word/2010/wordml" wp14:textId="77777777">
       <w:pPr>
         <w:pStyle w:val="Colorful List - Accent 1"/>
         <w:rPr>
-          <w:rFonts w:ascii="Arial" w:cs="Arial" w:hAnsi="Arial" w:eastAsia="Arial"/>
-          <w:sz w:val="20"/>
-          <w:szCs w:val="20"/>
-          <w:lang w:val="en-US"/>
-        </w:rPr>
-      </w:pPr>
-    </w:p>
-    <w:p>
+          <w:rFonts w:ascii="Arial" w:hAnsi="Arial" w:eastAsia="Arial" w:cs="Arial"/>
+          <w:sz w:val="20"/>
+          <w:szCs w:val="20"/>
+          <w:lang w:val="en-US"/>
+        </w:rPr>
+      </w:pPr>
+    </w:p>
+    <w:p xmlns:wp14="http://schemas.microsoft.com/office/word/2010/wordml" wp14:textId="77777777">
       <w:pPr>
         <w:pStyle w:val="Colorful List - Accent 1"/>
         <w:rPr>
-          <w:rFonts w:ascii="Arial" w:cs="Arial" w:hAnsi="Arial" w:eastAsia="Arial"/>
+          <w:rFonts w:ascii="Arial" w:hAnsi="Arial" w:eastAsia="Arial" w:cs="Arial"/>
           <w:sz w:val="20"/>
           <w:szCs w:val="20"/>
           <w:lang w:val="en-US"/>
@@ -3944,11 +4123,11 @@
         <w:t>Oxford Brookes University</w:t>
       </w:r>
     </w:p>
-    <w:p>
+    <w:p xmlns:wp14="http://schemas.microsoft.com/office/word/2010/wordml" wp14:textId="77777777">
       <w:pPr>
         <w:pStyle w:val="Colorful List - Accent 1"/>
         <w:rPr>
-          <w:rFonts w:ascii="Arial" w:cs="Arial" w:hAnsi="Arial" w:eastAsia="Arial"/>
+          <w:rFonts w:ascii="Arial" w:hAnsi="Arial" w:eastAsia="Arial" w:cs="Arial"/>
           <w:sz w:val="20"/>
           <w:szCs w:val="20"/>
           <w:lang w:val="en-US"/>
@@ -3965,11 +4144,11 @@
         <w:t>Oxford,</w:t>
       </w:r>
     </w:p>
-    <w:p>
+    <w:p xmlns:wp14="http://schemas.microsoft.com/office/word/2010/wordml" wp14:textId="77777777">
       <w:pPr>
         <w:pStyle w:val="Colorful List - Accent 1"/>
         <w:rPr>
-          <w:rFonts w:ascii="Arial" w:cs="Arial" w:hAnsi="Arial" w:eastAsia="Arial"/>
+          <w:rFonts w:ascii="Arial" w:hAnsi="Arial" w:eastAsia="Arial" w:cs="Arial"/>
           <w:sz w:val="20"/>
           <w:szCs w:val="20"/>
           <w:lang w:val="en-US"/>
@@ -3986,11 +4165,11 @@
         <w:t>United Kingdom.</w:t>
       </w:r>
     </w:p>
-    <w:p>
+    <w:p xmlns:wp14="http://schemas.microsoft.com/office/word/2010/wordml" wp14:textId="77777777">
       <w:pPr>
         <w:pStyle w:val="Colorful List - Accent 1"/>
         <w:rPr>
-          <w:rFonts w:ascii="Arial" w:cs="Arial" w:hAnsi="Arial" w:eastAsia="Arial"/>
+          <w:rFonts w:ascii="Arial" w:hAnsi="Arial" w:eastAsia="Arial" w:cs="Arial"/>
           <w:sz w:val="20"/>
           <w:szCs w:val="20"/>
           <w:lang w:val="en-US"/>
@@ -4007,22 +4186,22 @@
         <w:t>Cert Credit Modular                                                                      2008-2009</w:t>
       </w:r>
     </w:p>
-    <w:p>
+    <w:p xmlns:wp14="http://schemas.microsoft.com/office/word/2010/wordml" wp14:textId="77777777">
       <w:pPr>
         <w:pStyle w:val="Colorful List - Accent 1"/>
         <w:rPr>
-          <w:rFonts w:ascii="Arial" w:cs="Arial" w:hAnsi="Arial" w:eastAsia="Arial"/>
-          <w:sz w:val="20"/>
-          <w:szCs w:val="20"/>
-          <w:lang w:val="en-US"/>
-        </w:rPr>
-      </w:pPr>
-    </w:p>
-    <w:p>
+          <w:rFonts w:ascii="Arial" w:hAnsi="Arial" w:eastAsia="Arial" w:cs="Arial"/>
+          <w:sz w:val="20"/>
+          <w:szCs w:val="20"/>
+          <w:lang w:val="en-US"/>
+        </w:rPr>
+      </w:pPr>
+    </w:p>
+    <w:p xmlns:wp14="http://schemas.microsoft.com/office/word/2010/wordml" wp14:textId="77777777">
       <w:pPr>
         <w:pStyle w:val="Colorful List - Accent 1"/>
         <w:rPr>
-          <w:rFonts w:ascii="Arial" w:cs="Arial" w:hAnsi="Arial" w:eastAsia="Arial"/>
+          <w:rFonts w:ascii="Arial" w:hAnsi="Arial" w:eastAsia="Arial" w:cs="Arial"/>
           <w:sz w:val="20"/>
           <w:szCs w:val="20"/>
           <w:lang w:val="en-US"/>
@@ -4039,11 +4218,11 @@
         <w:t>NIIT,</w:t>
       </w:r>
     </w:p>
-    <w:p>
+    <w:p xmlns:wp14="http://schemas.microsoft.com/office/word/2010/wordml" wp14:textId="77777777">
       <w:pPr>
         <w:pStyle w:val="Colorful List - Accent 1"/>
         <w:rPr>
-          <w:rFonts w:ascii="Arial" w:cs="Arial" w:hAnsi="Arial" w:eastAsia="Arial"/>
+          <w:rFonts w:ascii="Arial" w:hAnsi="Arial" w:eastAsia="Arial" w:cs="Arial"/>
           <w:sz w:val="20"/>
           <w:szCs w:val="20"/>
           <w:lang w:val="en-US"/>
@@ -4060,11 +4239,11 @@
         <w:t>Abuja, Nigeria</w:t>
       </w:r>
     </w:p>
-    <w:p>
+    <w:p xmlns:wp14="http://schemas.microsoft.com/office/word/2010/wordml" wp14:textId="77777777">
       <w:pPr>
         <w:pStyle w:val="Colorful List - Accent 1"/>
         <w:rPr>
-          <w:rFonts w:ascii="Arial" w:cs="Arial" w:hAnsi="Arial" w:eastAsia="Arial"/>
+          <w:rFonts w:ascii="Arial" w:hAnsi="Arial" w:eastAsia="Arial" w:cs="Arial"/>
           <w:sz w:val="20"/>
           <w:szCs w:val="20"/>
           <w:lang w:val="en-US"/>
@@ -4081,11 +4260,11 @@
         <w:t>JAVA</w:t>
       </w:r>
     </w:p>
-    <w:p>
+    <w:p xmlns:wp14="http://schemas.microsoft.com/office/word/2010/wordml" wp14:textId="77777777">
       <w:pPr>
         <w:pStyle w:val="Colorful List - Accent 1"/>
         <w:rPr>
-          <w:rFonts w:ascii="Arial" w:cs="Arial" w:hAnsi="Arial" w:eastAsia="Arial"/>
+          <w:rFonts w:ascii="Arial" w:hAnsi="Arial" w:eastAsia="Arial" w:cs="Arial"/>
           <w:sz w:val="20"/>
           <w:szCs w:val="20"/>
           <w:lang w:val="en-US"/>
@@ -4102,7 +4281,7 @@
         <w:t xml:space="preserve">Developing Enterprise-wide Application 1 and 11 </w:t>
       </w:r>
     </w:p>
-    <w:p>
+    <w:p xmlns:wp14="http://schemas.microsoft.com/office/word/2010/wordml" wp14:textId="77777777">
       <w:pPr>
         <w:pStyle w:val="Colorful List - Accent 1"/>
         <w:pBdr>
@@ -4112,7 +4291,7 @@
           <w:right w:val="nil"/>
         </w:pBdr>
         <w:rPr>
-          <w:rFonts w:ascii="Times New Roman" w:cs="Times New Roman" w:hAnsi="Times New Roman" w:eastAsia="Times New Roman"/>
+          <w:rFonts w:ascii="Times New Roman" w:hAnsi="Times New Roman" w:eastAsia="Times New Roman" w:cs="Times New Roman"/>
           <w:sz w:val="20"/>
           <w:szCs w:val="20"/>
           <w:lang w:val="en-US"/>
@@ -4139,7 +4318,7 @@
         <w:t>) V2.0                                                                    2010-2011</w:t>
       </w:r>
     </w:p>
-    <w:p>
+    <w:p xmlns:wp14="http://schemas.microsoft.com/office/word/2010/wordml" wp14:textId="77777777">
       <w:pPr>
         <w:pStyle w:val="Normal.0"/>
         <w:jc w:val="center"/>
@@ -4162,14 +4341,15 @@
       <w:pgSz w:w="11900" w:h="16840" w:orient="portrait"/>
       <w:pgMar w:top="1440" w:right="701" w:bottom="1440" w:left="993" w:header="708" w:footer="708"/>
       <w:bidi w:val="0"/>
+      <w:cols w:num="1"/>
     </w:sectPr>
   </w:body>
 </w:document>
 </file>
 
 <file path=word/footer1.xml><?xml version="1.0" encoding="utf-8"?>
-<w:ftr xmlns:r="http://schemas.openxmlformats.org/officeDocument/2006/relationships" xmlns:wp="http://schemas.openxmlformats.org/drawingml/2006/wordprocessingDrawing" xmlns:w="http://schemas.openxmlformats.org/wordprocessingml/2006/main" xmlns:w10="urn:schemas-microsoft-com:office:word" xmlns:w14="http://schemas.microsoft.com/office/word/2010/wordml" xmlns:wps="http://schemas.microsoft.com/office/word/2010/wordprocessingShape" xmlns:wpg="http://schemas.microsoft.com/office/word/2010/wordprocessingGroup" xmlns:mc="http://schemas.openxmlformats.org/markup-compatibility/2006" xmlns:v="urn:schemas-microsoft-com:vml" xmlns:o="urn:schemas-microsoft-com:office:office" xmlns:m="http://schemas.openxmlformats.org/officeDocument/2006/math" mc:Ignorable="w14">
-  <w:p>
+<w:ftr xmlns:wp14="http://schemas.microsoft.com/office/word/2010/wordprocessingDrawing" xmlns:r="http://schemas.openxmlformats.org/officeDocument/2006/relationships" xmlns:wp="http://schemas.openxmlformats.org/drawingml/2006/wordprocessingDrawing" xmlns:w="http://schemas.openxmlformats.org/wordprocessingml/2006/main" xmlns:w10="urn:schemas-microsoft-com:office:word" xmlns:w14="http://schemas.microsoft.com/office/word/2010/wordml" xmlns:wps="http://schemas.microsoft.com/office/word/2010/wordprocessingShape" xmlns:wpg="http://schemas.microsoft.com/office/word/2010/wordprocessingGroup" xmlns:mc="http://schemas.openxmlformats.org/markup-compatibility/2006" xmlns:v="urn:schemas-microsoft-com:vml" xmlns:o="urn:schemas-microsoft-com:office:office" xmlns:m="http://schemas.openxmlformats.org/officeDocument/2006/math" mc:Ignorable="w14 wp14">
+  <w:p xmlns:wp14="http://schemas.microsoft.com/office/word/2010/wordml" wp14:textId="77777777">
     <w:pPr>
       <w:pStyle w:val="Header &amp; Footer"/>
       <w:bidi w:val="0"/>
@@ -4180,8 +4360,8 @@
 </file>
 
 <file path=word/header1.xml><?xml version="1.0" encoding="utf-8"?>
-<w:hdr xmlns:r="http://schemas.openxmlformats.org/officeDocument/2006/relationships" xmlns:wp="http://schemas.openxmlformats.org/drawingml/2006/wordprocessingDrawing" xmlns:w="http://schemas.openxmlformats.org/wordprocessingml/2006/main" xmlns:w10="urn:schemas-microsoft-com:office:word" xmlns:w14="http://schemas.microsoft.com/office/word/2010/wordml" xmlns:wps="http://schemas.microsoft.com/office/word/2010/wordprocessingShape" xmlns:wpg="http://schemas.microsoft.com/office/word/2010/wordprocessingGroup" xmlns:mc="http://schemas.openxmlformats.org/markup-compatibility/2006" xmlns:v="urn:schemas-microsoft-com:vml" xmlns:o="urn:schemas-microsoft-com:office:office" xmlns:m="http://schemas.openxmlformats.org/officeDocument/2006/math" mc:Ignorable="w14">
-  <w:p>
+<w:hdr xmlns:wp14="http://schemas.microsoft.com/office/word/2010/wordprocessingDrawing" xmlns:r="http://schemas.openxmlformats.org/officeDocument/2006/relationships" xmlns:wp="http://schemas.openxmlformats.org/drawingml/2006/wordprocessingDrawing" xmlns:w="http://schemas.openxmlformats.org/wordprocessingml/2006/main" xmlns:w10="urn:schemas-microsoft-com:office:word" xmlns:w14="http://schemas.microsoft.com/office/word/2010/wordml" xmlns:wps="http://schemas.microsoft.com/office/word/2010/wordprocessingShape" xmlns:wpg="http://schemas.microsoft.com/office/word/2010/wordprocessingGroup" xmlns:mc="http://schemas.openxmlformats.org/markup-compatibility/2006" xmlns:v="urn:schemas-microsoft-com:vml" xmlns:o="urn:schemas-microsoft-com:office:office" xmlns:m="http://schemas.openxmlformats.org/officeDocument/2006/math" mc:Ignorable="w14 wp14">
+  <w:p xmlns:wp14="http://schemas.microsoft.com/office/word/2010/wordml" wp14:textId="77777777">
     <w:pPr>
       <w:pStyle w:val="Header &amp; Footer"/>
       <w:bidi w:val="0"/>
@@ -4194,10 +4374,12 @@
 <file path=word/numbering.xml><?xml version="1.0" encoding="utf-8"?>
 <w:numbering xmlns:w="http://schemas.openxmlformats.org/wordprocessingml/2006/main" xmlns:wp="http://schemas.openxmlformats.org/drawingml/2006/wordprocessingDrawing" xmlns:w14="http://schemas.microsoft.com/office/word/2010/wordml" xmlns:r="http://schemas.openxmlformats.org/officeDocument/2006/relationships" xmlns:v="urn:schemas-microsoft-com:vml" xmlns:o="urn:schemas-microsoft-com:office:office">
   <w:abstractNum w:abstractNumId="0">
+    <w:nsid w:val="520fc937"/>
     <w:multiLevelType w:val="hybridMultilevel"/>
     <w:numStyleLink w:val="Imported Style 1"/>
   </w:abstractNum>
   <w:abstractNum w:abstractNumId="1">
+    <w:nsid w:val="78af35a9"/>
     <w:multiLevelType w:val="hybridMultilevel"/>
     <w:styleLink w:val="Imported Style 1"/>
     <w:lvl w:ilvl="0">
@@ -4210,7 +4392,7 @@
         <w:ind w:left="792" w:hanging="432"/>
       </w:pPr>
       <w:rPr>
-        <w:rFonts w:ascii="Symbol" w:cs="Symbol" w:hAnsi="Symbol" w:eastAsia="Symbol"/>
+        <w:rFonts w:ascii="Symbol" w:hAnsi="Symbol" w:eastAsia="Symbol" w:cs="Symbol"/>
         <w:b w:val="0"/>
         <w:bCs w:val="0"/>
         <w:i w:val="0"/>
@@ -4240,7 +4422,7 @@
         <w:ind w:left="1512" w:hanging="432"/>
       </w:pPr>
       <w:rPr>
-        <w:rFonts w:ascii="Arial Unicode MS" w:cs="Arial Unicode MS" w:hAnsi="Arial Unicode MS" w:eastAsia="Arial Unicode MS"/>
+        <w:rFonts w:ascii="Arial Unicode MS" w:hAnsi="Arial Unicode MS" w:eastAsia="Arial Unicode MS" w:cs="Arial Unicode MS"/>
         <w:b w:val="0"/>
         <w:bCs w:val="0"/>
         <w:i w:val="0"/>
@@ -4270,7 +4452,7 @@
         <w:ind w:left="2232" w:hanging="432"/>
       </w:pPr>
       <w:rPr>
-        <w:rFonts w:ascii="Arial Unicode MS" w:cs="Arial Unicode MS" w:hAnsi="Arial Unicode MS" w:eastAsia="Arial Unicode MS"/>
+        <w:rFonts w:ascii="Arial Unicode MS" w:hAnsi="Arial Unicode MS" w:eastAsia="Arial Unicode MS" w:cs="Arial Unicode MS"/>
         <w:b w:val="0"/>
         <w:bCs w:val="0"/>
         <w:i w:val="0"/>
@@ -4300,7 +4482,7 @@
         <w:ind w:left="2952" w:hanging="432"/>
       </w:pPr>
       <w:rPr>
-        <w:rFonts w:ascii="Symbol" w:cs="Symbol" w:hAnsi="Symbol" w:eastAsia="Symbol"/>
+        <w:rFonts w:ascii="Symbol" w:hAnsi="Symbol" w:eastAsia="Symbol" w:cs="Symbol"/>
         <w:b w:val="0"/>
         <w:bCs w:val="0"/>
         <w:i w:val="0"/>
@@ -4330,7 +4512,7 @@
         <w:ind w:left="3672" w:hanging="432"/>
       </w:pPr>
       <w:rPr>
-        <w:rFonts w:ascii="Arial Unicode MS" w:cs="Arial Unicode MS" w:hAnsi="Arial Unicode MS" w:eastAsia="Arial Unicode MS"/>
+        <w:rFonts w:ascii="Arial Unicode MS" w:hAnsi="Arial Unicode MS" w:eastAsia="Arial Unicode MS" w:cs="Arial Unicode MS"/>
         <w:b w:val="0"/>
         <w:bCs w:val="0"/>
         <w:i w:val="0"/>
@@ -4360,7 +4542,7 @@
         <w:ind w:left="4392" w:hanging="432"/>
       </w:pPr>
       <w:rPr>
-        <w:rFonts w:ascii="Arial Unicode MS" w:cs="Arial Unicode MS" w:hAnsi="Arial Unicode MS" w:eastAsia="Arial Unicode MS"/>
+        <w:rFonts w:ascii="Arial Unicode MS" w:hAnsi="Arial Unicode MS" w:eastAsia="Arial Unicode MS" w:cs="Arial Unicode MS"/>
         <w:b w:val="0"/>
         <w:bCs w:val="0"/>
         <w:i w:val="0"/>
@@ -4390,7 +4572,7 @@
         <w:ind w:left="5112" w:hanging="432"/>
       </w:pPr>
       <w:rPr>
-        <w:rFonts w:ascii="Symbol" w:cs="Symbol" w:hAnsi="Symbol" w:eastAsia="Symbol"/>
+        <w:rFonts w:ascii="Symbol" w:hAnsi="Symbol" w:eastAsia="Symbol" w:cs="Symbol"/>
         <w:b w:val="0"/>
         <w:bCs w:val="0"/>
         <w:i w:val="0"/>
@@ -4420,7 +4602,7 @@
         <w:ind w:left="5832" w:hanging="432"/>
       </w:pPr>
       <w:rPr>
-        <w:rFonts w:ascii="Arial Unicode MS" w:cs="Arial Unicode MS" w:hAnsi="Arial Unicode MS" w:eastAsia="Arial Unicode MS"/>
+        <w:rFonts w:ascii="Arial Unicode MS" w:hAnsi="Arial Unicode MS" w:eastAsia="Arial Unicode MS" w:cs="Arial Unicode MS"/>
         <w:b w:val="0"/>
         <w:bCs w:val="0"/>
         <w:i w:val="0"/>
@@ -4450,7 +4632,7 @@
         <w:ind w:left="6552" w:hanging="432"/>
       </w:pPr>
       <w:rPr>
-        <w:rFonts w:ascii="Arial Unicode MS" w:cs="Arial Unicode MS" w:hAnsi="Arial Unicode MS" w:eastAsia="Arial Unicode MS"/>
+        <w:rFonts w:ascii="Arial Unicode MS" w:hAnsi="Arial Unicode MS" w:eastAsia="Arial Unicode MS" w:cs="Arial Unicode MS"/>
         <w:b w:val="0"/>
         <w:bCs w:val="0"/>
         <w:i w:val="0"/>
@@ -4472,10 +4654,12 @@
     </w:lvl>
   </w:abstractNum>
   <w:abstractNum w:abstractNumId="2">
+    <w:nsid w:val="5ece8beb"/>
     <w:multiLevelType w:val="hybridMultilevel"/>
     <w:numStyleLink w:val="Bullets"/>
   </w:abstractNum>
   <w:abstractNum w:abstractNumId="3">
+    <w:nsid w:val="65e2e7da"/>
     <w:multiLevelType w:val="hybridMultilevel"/>
     <w:styleLink w:val="Bullets"/>
     <w:lvl w:ilvl="0">
@@ -4714,10 +4898,12 @@
     </w:lvl>
   </w:abstractNum>
   <w:abstractNum w:abstractNumId="4">
+    <w:nsid w:val="73617921"/>
     <w:multiLevelType w:val="hybridMultilevel"/>
     <w:numStyleLink w:val="Imported Style 3"/>
   </w:abstractNum>
   <w:abstractNum w:abstractNumId="5">
+    <w:nsid w:val="3ae4a530"/>
     <w:multiLevelType w:val="hybridMultilevel"/>
     <w:styleLink w:val="Imported Style 3"/>
     <w:lvl w:ilvl="0">
@@ -4730,7 +4916,7 @@
         <w:ind w:left="720" w:hanging="360"/>
       </w:pPr>
       <w:rPr>
-        <w:rFonts w:ascii="Symbol" w:cs="Symbol" w:hAnsi="Symbol" w:eastAsia="Symbol"/>
+        <w:rFonts w:ascii="Symbol" w:hAnsi="Symbol" w:eastAsia="Symbol" w:cs="Symbol"/>
         <w:b w:val="0"/>
         <w:bCs w:val="0"/>
         <w:i w:val="0"/>
@@ -4760,7 +4946,7 @@
         <w:ind w:left="1440" w:hanging="360"/>
       </w:pPr>
       <w:rPr>
-        <w:rFonts w:ascii="Arial Unicode MS" w:cs="Arial Unicode MS" w:hAnsi="Arial Unicode MS" w:eastAsia="Arial Unicode MS"/>
+        <w:rFonts w:ascii="Arial Unicode MS" w:hAnsi="Arial Unicode MS" w:eastAsia="Arial Unicode MS" w:cs="Arial Unicode MS"/>
         <w:b w:val="0"/>
         <w:bCs w:val="0"/>
         <w:i w:val="0"/>
@@ -4790,7 +4976,7 @@
         <w:ind w:left="2160" w:hanging="360"/>
       </w:pPr>
       <w:rPr>
-        <w:rFonts w:ascii="Arial Unicode MS" w:cs="Arial Unicode MS" w:hAnsi="Arial Unicode MS" w:eastAsia="Arial Unicode MS"/>
+        <w:rFonts w:ascii="Arial Unicode MS" w:hAnsi="Arial Unicode MS" w:eastAsia="Arial Unicode MS" w:cs="Arial Unicode MS"/>
         <w:b w:val="0"/>
         <w:bCs w:val="0"/>
         <w:i w:val="0"/>
@@ -4820,7 +5006,7 @@
         <w:ind w:left="2880" w:hanging="360"/>
       </w:pPr>
       <w:rPr>
-        <w:rFonts w:ascii="Symbol" w:cs="Symbol" w:hAnsi="Symbol" w:eastAsia="Symbol"/>
+        <w:rFonts w:ascii="Symbol" w:hAnsi="Symbol" w:eastAsia="Symbol" w:cs="Symbol"/>
         <w:b w:val="0"/>
         <w:bCs w:val="0"/>
         <w:i w:val="0"/>
@@ -4850,7 +5036,7 @@
         <w:ind w:left="3600" w:hanging="360"/>
       </w:pPr>
       <w:rPr>
-        <w:rFonts w:ascii="Arial Unicode MS" w:cs="Arial Unicode MS" w:hAnsi="Arial Unicode MS" w:eastAsia="Arial Unicode MS"/>
+        <w:rFonts w:ascii="Arial Unicode MS" w:hAnsi="Arial Unicode MS" w:eastAsia="Arial Unicode MS" w:cs="Arial Unicode MS"/>
         <w:b w:val="0"/>
         <w:bCs w:val="0"/>
         <w:i w:val="0"/>
@@ -4880,7 +5066,7 @@
         <w:ind w:left="4320" w:hanging="360"/>
       </w:pPr>
       <w:rPr>
-        <w:rFonts w:ascii="Arial Unicode MS" w:cs="Arial Unicode MS" w:hAnsi="Arial Unicode MS" w:eastAsia="Arial Unicode MS"/>
+        <w:rFonts w:ascii="Arial Unicode MS" w:hAnsi="Arial Unicode MS" w:eastAsia="Arial Unicode MS" w:cs="Arial Unicode MS"/>
         <w:b w:val="0"/>
         <w:bCs w:val="0"/>
         <w:i w:val="0"/>
@@ -4910,7 +5096,7 @@
         <w:ind w:left="5040" w:hanging="360"/>
       </w:pPr>
       <w:rPr>
-        <w:rFonts w:ascii="Symbol" w:cs="Symbol" w:hAnsi="Symbol" w:eastAsia="Symbol"/>
+        <w:rFonts w:ascii="Symbol" w:hAnsi="Symbol" w:eastAsia="Symbol" w:cs="Symbol"/>
         <w:b w:val="0"/>
         <w:bCs w:val="0"/>
         <w:i w:val="0"/>
@@ -4940,7 +5126,7 @@
         <w:ind w:left="5760" w:hanging="360"/>
       </w:pPr>
       <w:rPr>
-        <w:rFonts w:ascii="Arial Unicode MS" w:cs="Arial Unicode MS" w:hAnsi="Arial Unicode MS" w:eastAsia="Arial Unicode MS"/>
+        <w:rFonts w:ascii="Arial Unicode MS" w:hAnsi="Arial Unicode MS" w:eastAsia="Arial Unicode MS" w:cs="Arial Unicode MS"/>
         <w:b w:val="0"/>
         <w:bCs w:val="0"/>
         <w:i w:val="0"/>
@@ -4970,7 +5156,7 @@
         <w:ind w:left="6480" w:hanging="360"/>
       </w:pPr>
       <w:rPr>
-        <w:rFonts w:ascii="Arial Unicode MS" w:cs="Arial Unicode MS" w:hAnsi="Arial Unicode MS" w:eastAsia="Arial Unicode MS"/>
+        <w:rFonts w:ascii="Arial Unicode MS" w:hAnsi="Arial Unicode MS" w:eastAsia="Arial Unicode MS" w:cs="Arial Unicode MS"/>
         <w:b w:val="0"/>
         <w:bCs w:val="0"/>
         <w:i w:val="0"/>
@@ -5010,7 +5196,7 @@
           <w:ind w:left="792" w:hanging="432"/>
         </w:pPr>
         <w:rPr>
-          <w:rFonts w:ascii="Symbol" w:cs="Symbol" w:hAnsi="Symbol" w:eastAsia="Symbol"/>
+          <w:rFonts w:ascii="Symbol" w:hAnsi="Symbol" w:eastAsia="Symbol" w:cs="Symbol"/>
           <w:b w:val="0"/>
           <w:bCs w:val="0"/>
           <w:i w:val="0"/>
@@ -5042,7 +5228,7 @@
           <w:ind w:left="1440" w:hanging="360"/>
         </w:pPr>
         <w:rPr>
-          <w:rFonts w:ascii="Arial Unicode MS" w:cs="Arial Unicode MS" w:hAnsi="Arial Unicode MS" w:eastAsia="Arial Unicode MS"/>
+          <w:rFonts w:ascii="Arial Unicode MS" w:hAnsi="Arial Unicode MS" w:eastAsia="Arial Unicode MS" w:cs="Arial Unicode MS"/>
           <w:b w:val="0"/>
           <w:bCs w:val="0"/>
           <w:i w:val="0"/>
@@ -5074,7 +5260,7 @@
           <w:ind w:left="2160" w:hanging="360"/>
         </w:pPr>
         <w:rPr>
-          <w:rFonts w:ascii="Arial Unicode MS" w:cs="Arial Unicode MS" w:hAnsi="Arial Unicode MS" w:eastAsia="Arial Unicode MS"/>
+          <w:rFonts w:ascii="Arial Unicode MS" w:hAnsi="Arial Unicode MS" w:eastAsia="Arial Unicode MS" w:cs="Arial Unicode MS"/>
           <w:b w:val="0"/>
           <w:bCs w:val="0"/>
           <w:i w:val="0"/>
@@ -5106,7 +5292,7 @@
           <w:ind w:left="2880" w:hanging="360"/>
         </w:pPr>
         <w:rPr>
-          <w:rFonts w:ascii="Symbol" w:cs="Symbol" w:hAnsi="Symbol" w:eastAsia="Symbol"/>
+          <w:rFonts w:ascii="Symbol" w:hAnsi="Symbol" w:eastAsia="Symbol" w:cs="Symbol"/>
           <w:b w:val="0"/>
           <w:bCs w:val="0"/>
           <w:i w:val="0"/>
@@ -5138,7 +5324,7 @@
           <w:ind w:left="3600" w:hanging="360"/>
         </w:pPr>
         <w:rPr>
-          <w:rFonts w:ascii="Arial Unicode MS" w:cs="Arial Unicode MS" w:hAnsi="Arial Unicode MS" w:eastAsia="Arial Unicode MS"/>
+          <w:rFonts w:ascii="Arial Unicode MS" w:hAnsi="Arial Unicode MS" w:eastAsia="Arial Unicode MS" w:cs="Arial Unicode MS"/>
           <w:b w:val="0"/>
           <w:bCs w:val="0"/>
           <w:i w:val="0"/>
@@ -5170,7 +5356,7 @@
           <w:ind w:left="4320" w:hanging="360"/>
         </w:pPr>
         <w:rPr>
-          <w:rFonts w:ascii="Arial Unicode MS" w:cs="Arial Unicode MS" w:hAnsi="Arial Unicode MS" w:eastAsia="Arial Unicode MS"/>
+          <w:rFonts w:ascii="Arial Unicode MS" w:hAnsi="Arial Unicode MS" w:eastAsia="Arial Unicode MS" w:cs="Arial Unicode MS"/>
           <w:b w:val="0"/>
           <w:bCs w:val="0"/>
           <w:i w:val="0"/>
@@ -5202,7 +5388,7 @@
           <w:ind w:left="5040" w:hanging="360"/>
         </w:pPr>
         <w:rPr>
-          <w:rFonts w:ascii="Symbol" w:cs="Symbol" w:hAnsi="Symbol" w:eastAsia="Symbol"/>
+          <w:rFonts w:ascii="Symbol" w:hAnsi="Symbol" w:eastAsia="Symbol" w:cs="Symbol"/>
           <w:b w:val="0"/>
           <w:bCs w:val="0"/>
           <w:i w:val="0"/>
@@ -5234,7 +5420,7 @@
           <w:ind w:left="5760" w:hanging="360"/>
         </w:pPr>
         <w:rPr>
-          <w:rFonts w:ascii="Arial Unicode MS" w:cs="Arial Unicode MS" w:hAnsi="Arial Unicode MS" w:eastAsia="Arial Unicode MS"/>
+          <w:rFonts w:ascii="Arial Unicode MS" w:hAnsi="Arial Unicode MS" w:eastAsia="Arial Unicode MS" w:cs="Arial Unicode MS"/>
           <w:b w:val="0"/>
           <w:bCs w:val="0"/>
           <w:i w:val="0"/>
@@ -5266,7 +5452,7 @@
           <w:ind w:left="6480" w:hanging="360"/>
         </w:pPr>
         <w:rPr>
-          <w:rFonts w:ascii="Arial Unicode MS" w:cs="Arial Unicode MS" w:hAnsi="Arial Unicode MS" w:eastAsia="Arial Unicode MS"/>
+          <w:rFonts w:ascii="Arial Unicode MS" w:hAnsi="Arial Unicode MS" w:eastAsia="Arial Unicode MS" w:cs="Arial Unicode MS"/>
           <w:b w:val="0"/>
           <w:bCs w:val="0"/>
           <w:i w:val="0"/>
@@ -5559,11 +5745,11 @@
 </file>
 
 <file path=word/styles.xml><?xml version="1.0" encoding="utf-8"?>
-<w:styles xmlns:w="http://schemas.openxmlformats.org/wordprocessingml/2006/main" xmlns:mc="http://schemas.openxmlformats.org/markup-compatibility/2006" xmlns:w14="http://schemas.microsoft.com/office/word/2010/wordml" mc:Ignorable="w14">
+<w:styles xmlns:wp14="http://schemas.microsoft.com/office/word/2010/wordprocessingDrawing" xmlns:w="http://schemas.openxmlformats.org/wordprocessingml/2006/main" xmlns:mc="http://schemas.openxmlformats.org/markup-compatibility/2006" xmlns:w14="http://schemas.microsoft.com/office/word/2010/wordml" mc:Ignorable="w14 wp14">
   <w:docDefaults>
     <w:rPrDefault>
       <w:rPr>
-        <w:rFonts w:ascii="Times New Roman" w:cs="Times New Roman" w:hAnsi="Times New Roman" w:eastAsia="Arial Unicode MS"/>
+        <w:rFonts w:ascii="Times New Roman" w:hAnsi="Times New Roman" w:eastAsia="Arial Unicode MS" w:cs="Times New Roman"/>
         <w:b w:val="0"/>
         <w:bCs w:val="0"/>
         <w:i w:val="0"/>
@@ -5594,7 +5780,7 @@
         <w:keepNext w:val="0"/>
         <w:keepLines w:val="0"/>
         <w:pageBreakBefore w:val="0"/>
-        <w:framePr w:anchorLock="0" w:w="0" w:h="0" w:vSpace="0" w:hSpace="0" w:xAlign="left" w:y="0" w:hRule="exact" w:vAnchor="margin"/>
+        <w:framePr w:w="0" w:h="0" w:vSpace="0" w:hSpace="0" w:vAnchor="margin" w:xAlign="left" w:y="0" w:hRule="exact" w:anchorLock="0"/>
         <w:widowControl w:val="1"/>
         <w:numPr>
           <w:ilvl w:val="0"/>
@@ -5618,7 +5804,7 @@
       </w:pPr>
     </w:pPrDefault>
   </w:docDefaults>
-  <w:style w:type="paragraph" w:default="1" w:styleId="Normal">
+  <w:style w:type="paragraph" w:styleId="Normal" w:default="1">
     <w:name w:val="Normal"/>
     <w:next w:val="Normal"/>
     <w:pPr/>
@@ -5628,7 +5814,7 @@
       <w:lang w:val="en-US" w:eastAsia="en-US" w:bidi="ar-SA"/>
     </w:rPr>
   </w:style>
-  <w:style w:type="character" w:default="1" w:styleId="Default Paragraph Font">
+  <w:style w:type="character" w:styleId="Default Paragraph Font" w:default="1">
     <w:name w:val="Default Paragraph Font"/>
     <w:next w:val="Default Paragraph Font"/>
   </w:style>
@@ -5638,7 +5824,7 @@
       <w:u w:val="single"/>
     </w:rPr>
   </w:style>
-  <w:style w:type="table" w:default="1" w:styleId="Table Normal">
+  <w:style w:type="table" w:styleId="Table Normal" w:default="1">
     <w:name w:val="Table Normal"/>
     <w:next w:val="Table Normal"/>
     <w:pPr/>
@@ -5660,7 +5846,7 @@
     <w:tblStylePr w:type="seCell"/>
     <w:tblStylePr w:type="swCell"/>
   </w:style>
-  <w:style w:type="numbering" w:default="1" w:styleId="No List">
+  <w:style w:type="numbering" w:styleId="No List" w:default="1">
     <w:name w:val="No List"/>
     <w:next w:val="No List"/>
     <w:pPr/>
@@ -5685,7 +5871,7 @@
       <w:outlineLvl w:val="9"/>
     </w:pPr>
     <w:rPr>
-      <w:rFonts w:ascii="Helvetica Neue" w:cs="Arial Unicode MS" w:hAnsi="Helvetica Neue" w:eastAsia="Arial Unicode MS"/>
+      <w:rFonts w:ascii="Helvetica Neue" w:hAnsi="Helvetica Neue" w:eastAsia="Arial Unicode MS" w:cs="Arial Unicode MS"/>
       <w:b w:val="0"/>
       <w:bCs w:val="0"/>
       <w:i w:val="0"/>
@@ -5715,7 +5901,7 @@
     </w:rPr>
   </w:style>
   <w:style w:type="paragraph" w:styleId="Normal.0">
-    <w:name w:val="Normal"/>
+    <w:name w:val="Normal0"/>
     <w:next w:val="Normal.0"/>
     <w:pPr>
       <w:keepNext w:val="0"/>
@@ -5731,7 +5917,7 @@
       <w:outlineLvl w:val="9"/>
     </w:pPr>
     <w:rPr>
-      <w:rFonts w:ascii="Cambria" w:cs="Arial Unicode MS" w:hAnsi="Cambria" w:eastAsia="Arial Unicode MS"/>
+      <w:rFonts w:ascii="Cambria" w:hAnsi="Cambria" w:eastAsia="Arial Unicode MS" w:cs="Arial Unicode MS"/>
       <w:b w:val="0"/>
       <w:bCs w:val="0"/>
       <w:i w:val="0"/>
@@ -5779,7 +5965,7 @@
     <w:basedOn w:val="Link"/>
     <w:next w:val="Hyperlink.0"/>
     <w:rPr>
-      <w:rFonts w:ascii="Arial" w:cs="Arial" w:hAnsi="Arial" w:eastAsia="Arial"/>
+      <w:rFonts w:ascii="Arial" w:hAnsi="Arial" w:eastAsia="Arial" w:cs="Arial"/>
       <w:sz w:val="20"/>
       <w:szCs w:val="20"/>
       <w:lang w:val="en-US"/>
@@ -5802,7 +5988,7 @@
       <w:outlineLvl w:val="9"/>
     </w:pPr>
     <w:rPr>
-      <w:rFonts w:ascii="Helvetica Neue" w:cs="Arial Unicode MS" w:hAnsi="Helvetica Neue" w:eastAsia="Arial Unicode MS"/>
+      <w:rFonts w:ascii="Helvetica Neue" w:hAnsi="Helvetica Neue" w:eastAsia="Arial Unicode MS" w:cs="Arial Unicode MS"/>
       <w:b w:val="0"/>
       <w:bCs w:val="0"/>
       <w:i w:val="0"/>
@@ -5865,7 +6051,7 @@
       <w:outlineLvl w:val="9"/>
     </w:pPr>
     <w:rPr>
-      <w:rFonts w:ascii="Cambria" w:cs="Arial Unicode MS" w:hAnsi="Cambria" w:eastAsia="Arial Unicode MS"/>
+      <w:rFonts w:ascii="Cambria" w:hAnsi="Cambria" w:eastAsia="Arial Unicode MS" w:cs="Arial Unicode MS"/>
       <w:b w:val="0"/>
       <w:bCs w:val="0"/>
       <w:i w:val="0"/>

</xml_diff>